<commit_message>
Fill remaining placeholders in seminar paper
Co-Authored-By: Claude Opus 5.5 <noreply@anthropic.com>
Claude-Session: https://claude.ai/code/session_01FmsKn8wvowcyLJgtaEyV4v
</commit_message>
<xml_diff>
--- a/seminar/עבירת-ההסתה-לגזענות-מיני-סמינר.docx
+++ b/seminar/עבירת-ההסתה-לגזענות-מיני-סמינר.docx
@@ -17,10 +17,9 @@
           <w:smallCaps w:val="false"/>
           <w:sz w:val="28"/>
           <w:szCs w:val="28"/>
-          <w:highlight w:val="yellow"/>
-          <w:rtl/>
-        </w:rPr>
-        <w:t xml:space="preserve">שם המוסד האקדמי</w:t>
+          <w:rtl/>
+        </w:rPr>
+        <w:t xml:space="preserve">המכללה האקדמית נתניה</w:t>
       </w:r>
     </w:p>
     <w:p>
@@ -36,10 +35,9 @@
           <w:smallCaps w:val="false"/>
           <w:sz w:val="26"/>
           <w:szCs w:val="26"/>
-          <w:highlight w:val="yellow"/>
-          <w:rtl/>
-        </w:rPr>
-        <w:t xml:space="preserve">הפקולטה / בית הספר למשפטים</w:t>
+          <w:rtl/>
+        </w:rPr>
+        <w:t xml:space="preserve">בית הספר למשפטים</w:t>
       </w:r>
     </w:p>
     <w:p>
@@ -131,8 +129,15 @@
           <w:szCs w:val="26"/>
           <w:rtl/>
         </w:rPr>
-        <w:t xml:space="preserve">מגיש/ה: </w:t>
-      </w:r>
+        <w:t xml:space="preserve">מגיש/ה: ____________________</w:t>
+      </w:r>
+    </w:p>
+    <w:p>
+      <w:pPr>
+        <w:bidi/>
+        <w:spacing w:after="120" w:before="0" w:line="360"/>
+        <w:jc w:val="center"/>
+      </w:pPr>
       <w:r>
         <w:rPr>
           <w:rFonts w:ascii="David" w:cs="David" w:eastAsia="David" w:hAnsi="David"/>
@@ -140,40 +145,9 @@
           <w:smallCaps w:val="false"/>
           <w:sz w:val="26"/>
           <w:szCs w:val="26"/>
-          <w:highlight w:val="yellow"/>
-          <w:rtl/>
-        </w:rPr>
-        <w:t xml:space="preserve">שם מלא</w:t>
-      </w:r>
-    </w:p>
-    <w:p>
-      <w:pPr>
-        <w:bidi/>
-        <w:spacing w:after="120" w:before="0" w:line="360"/>
-        <w:jc w:val="center"/>
-      </w:pPr>
-      <w:r>
-        <w:rPr>
-          <w:rFonts w:ascii="David" w:cs="David" w:eastAsia="David" w:hAnsi="David"/>
-          <w:i w:val="false"/>
-          <w:smallCaps w:val="false"/>
-          <w:sz w:val="26"/>
-          <w:szCs w:val="26"/>
-          <w:rtl/>
-        </w:rPr>
-        <w:t xml:space="preserve">ת"ז: </w:t>
-      </w:r>
-      <w:r>
-        <w:rPr>
-          <w:rFonts w:ascii="David" w:cs="David" w:eastAsia="David" w:hAnsi="David"/>
-          <w:i w:val="false"/>
-          <w:smallCaps w:val="false"/>
-          <w:sz w:val="26"/>
-          <w:szCs w:val="26"/>
-          <w:highlight w:val="yellow"/>
-          <w:rtl/>
-        </w:rPr>
-        <w:t xml:space="preserve">000000000</w:t>
+          <w:rtl/>
+        </w:rPr>
+        <w:t xml:space="preserve">ת"ז: ____________________</w:t>
       </w:r>
     </w:p>
     <w:p>
@@ -1597,19 +1571,7 @@
           <w:szCs w:val="24"/>
           <w:rtl/>
         </w:rPr>
-        <w:t xml:space="preserve"> </w:t>
-      </w:r>
-      <w:r>
-        <w:rPr>
-          <w:rFonts w:ascii="David" w:cs="David" w:eastAsia="David" w:hAnsi="David"/>
-          <w:i w:val="false"/>
-          <w:smallCaps w:val="false"/>
-          <w:sz w:val="24"/>
-          <w:szCs w:val="24"/>
-          <w:highlight w:val="yellow"/>
-          <w:rtl/>
-        </w:rPr>
-        <w:t xml:space="preserve">בשאלת התוכן הצטרף השופט טל לעמדת הנשיא ברק.</w:t>
+        <w:t xml:space="preserve"> בשאלת התוכן, לעומת זאת, הצטרפו לעמדת הנשיא ברק השופטים גולדברג, טל וטירקל, ולכן זו עמדת הרוב בפסק הדין, אף שחוות הדעת העיקרית נכתבה בידי מצא.</w:t>
       </w:r>
     </w:p>
     <w:p>
@@ -3965,30 +3927,7 @@
           <w:szCs w:val="24"/>
           <w:rtl/>
         </w:rPr>
-        <w:t xml:space="preserve"> 570 (</w:t>
-      </w:r>
-      <w:r>
-        <w:rPr>
-          <w:rFonts w:ascii="David" w:cs="David" w:eastAsia="David" w:hAnsi="David"/>
-          <w:i w:val="false"/>
-          <w:smallCaps w:val="false"/>
-          <w:sz w:val="24"/>
-          <w:szCs w:val="24"/>
-          <w:highlight w:val="yellow"/>
-          <w:rtl/>
-        </w:rPr>
-        <w:t xml:space="preserve">שמות העורכים</w:t>
-      </w:r>
-      <w:r>
-        <w:rPr>
-          <w:rFonts w:ascii="David" w:cs="David" w:eastAsia="David" w:hAnsi="David"/>
-          <w:i w:val="false"/>
-          <w:smallCaps w:val="false"/>
-          <w:sz w:val="24"/>
-          <w:szCs w:val="24"/>
-          <w:rtl/>
-        </w:rPr>
-        <w:t xml:space="preserve"> עורכים 2023).</w:t>
+        <w:t xml:space="preserve"> 570 (דפנה ברק-ארז עורכת ראשית 2023).</w:t>
       </w:r>
     </w:p>
     <w:p>
@@ -4117,30 +4056,7 @@
           <w:szCs w:val="24"/>
           <w:rtl/>
         </w:rPr>
-        <w:t xml:space="preserve"> 475 (</w:t>
-      </w:r>
-      <w:r>
-        <w:rPr>
-          <w:rFonts w:ascii="David" w:cs="David" w:eastAsia="David" w:hAnsi="David"/>
-          <w:i w:val="false"/>
-          <w:smallCaps w:val="false"/>
-          <w:sz w:val="24"/>
-          <w:szCs w:val="24"/>
-          <w:highlight w:val="yellow"/>
-          <w:rtl/>
-        </w:rPr>
-        <w:t xml:space="preserve">שמות העורכים</w:t>
-      </w:r>
-      <w:r>
-        <w:rPr>
-          <w:rFonts w:ascii="David" w:cs="David" w:eastAsia="David" w:hAnsi="David"/>
-          <w:i w:val="false"/>
-          <w:smallCaps w:val="false"/>
-          <w:sz w:val="24"/>
-          <w:szCs w:val="24"/>
-          <w:rtl/>
-        </w:rPr>
-        <w:t xml:space="preserve"> עורכים 2021).</w:t>
+        <w:t xml:space="preserve"> 475 (גרשון גונטובניק, אברהם וינרוט וחיים זיכרמן עורכים 2021).</w:t>
       </w:r>
     </w:p>
     <w:p>
@@ -4793,30 +4709,7 @@
           <w:szCs w:val="20"/>
           <w:rtl/>
         </w:rPr>
-        <w:t xml:space="preserve"> 570, 571 (</w:t>
-      </w:r>
-      <w:r>
-        <w:rPr>
-          <w:rFonts w:ascii="David" w:cs="David" w:eastAsia="David" w:hAnsi="David"/>
-          <w:i w:val="false"/>
-          <w:smallCaps w:val="false"/>
-          <w:sz w:val="20"/>
-          <w:szCs w:val="20"/>
-          <w:highlight w:val="yellow"/>
-          <w:rtl/>
-        </w:rPr>
-        <w:t xml:space="preserve">שמות העורכים</w:t>
-      </w:r>
-      <w:r>
-        <w:rPr>
-          <w:rFonts w:ascii="David" w:cs="David" w:eastAsia="David" w:hAnsi="David"/>
-          <w:i w:val="false"/>
-          <w:smallCaps w:val="false"/>
-          <w:sz w:val="20"/>
-          <w:szCs w:val="20"/>
-          <w:rtl/>
-        </w:rPr>
-        <w:t xml:space="preserve"> עורכים 2023).</w:t>
+        <w:t xml:space="preserve"> 570, 571 (דפנה ברק-ארז עורכת ראשית 2023).</w:t>
       </w:r>
     </w:p>
   </w:footnote>
@@ -6024,30 +5917,7 @@
           <w:szCs w:val="20"/>
           <w:rtl/>
         </w:rPr>
-        <w:t xml:space="preserve">, לעיל ה"ש 23, </w:t>
-      </w:r>
-      <w:r>
-        <w:rPr>
-          <w:rFonts w:ascii="David" w:cs="David" w:eastAsia="David" w:hAnsi="David"/>
-          <w:i w:val="false"/>
-          <w:smallCaps w:val="false"/>
-          <w:sz w:val="20"/>
-          <w:szCs w:val="20"/>
-          <w:highlight w:val="yellow"/>
-          <w:rtl/>
-        </w:rPr>
-        <w:t xml:space="preserve">פס' נו</w:t>
-      </w:r>
-      <w:r>
-        <w:rPr>
-          <w:rFonts w:ascii="David" w:cs="David" w:eastAsia="David" w:hAnsi="David"/>
-          <w:i w:val="false"/>
-          <w:smallCaps w:val="false"/>
-          <w:sz w:val="20"/>
-          <w:szCs w:val="20"/>
-          <w:rtl/>
-        </w:rPr>
-        <w:t xml:space="preserve">; גיל עשת "הלכת הצפיות: יסודות של ודאות מול שיקול-דעת שיפוטי על רקע תיקון 39 לחוק העונשין" </w:t>
+        <w:t xml:space="preserve">, לעיל ה"ש 23; גיל עשת "הלכת הצפיות: יסודות של ודאות מול שיקול-דעת שיפוטי על רקע תיקון 39 לחוק העונשין" </w:t>
       </w:r>
       <w:r>
         <w:rPr>
@@ -6221,30 +6091,7 @@
           <w:szCs w:val="20"/>
           <w:rtl/>
         </w:rPr>
-        <w:t xml:space="preserve"> 475, 484–485 (</w:t>
-      </w:r>
-      <w:r>
-        <w:rPr>
-          <w:rFonts w:ascii="David" w:cs="David" w:eastAsia="David" w:hAnsi="David"/>
-          <w:i w:val="false"/>
-          <w:smallCaps w:val="false"/>
-          <w:sz w:val="20"/>
-          <w:szCs w:val="20"/>
-          <w:highlight w:val="yellow"/>
-          <w:rtl/>
-        </w:rPr>
-        <w:t xml:space="preserve">שמות העורכים</w:t>
-      </w:r>
-      <w:r>
-        <w:rPr>
-          <w:rFonts w:ascii="David" w:cs="David" w:eastAsia="David" w:hAnsi="David"/>
-          <w:i w:val="false"/>
-          <w:smallCaps w:val="false"/>
-          <w:sz w:val="20"/>
-          <w:szCs w:val="20"/>
-          <w:rtl/>
-        </w:rPr>
-        <w:t xml:space="preserve"> עורכים 2021).</w:t>
+        <w:t xml:space="preserve"> 475, 484–485 (גרשון גונטובניק, אברהם וינרוט וחיים זיכרמן עורכים 2021).</w:t>
       </w:r>
     </w:p>
   </w:footnote>

</xml_diff>

<commit_message>
Disable proofing marks on every run in seminar paper
Co-Authored-By: Claude Opus 5.5 <noreply@anthropic.com>
Claude-Session: https://claude.ai/code/session_01FmsKn8wvowcyLJgtaEyV4v
</commit_message>
<xml_diff>
--- a/seminar/עבירת-ההסתה-לגזענות-מיני-סמינר.docx
+++ b/seminar/עבירת-ההסתה-לגזענות-מיני-סמינר.docx
@@ -15,6 +15,7 @@
           <w:bCs/>
           <w:i w:val="false"/>
           <w:smallCaps w:val="false"/>
+          <w:noProof/>
           <w:sz w:val="28"/>
           <w:szCs w:val="28"/>
           <w:rtl/>
@@ -33,6 +34,7 @@
           <w:rFonts w:ascii="David" w:cs="David" w:eastAsia="David" w:hAnsi="David"/>
           <w:i w:val="false"/>
           <w:smallCaps w:val="false"/>
+          <w:noProof/>
           <w:sz w:val="26"/>
           <w:szCs w:val="26"/>
           <w:rtl/>
@@ -51,6 +53,7 @@
           <w:rFonts w:ascii="David" w:cs="David" w:eastAsia="David" w:hAnsi="David"/>
           <w:i w:val="false"/>
           <w:smallCaps w:val="false"/>
+          <w:noProof/>
           <w:sz w:val="26"/>
           <w:szCs w:val="26"/>
           <w:rtl/>
@@ -69,6 +72,7 @@
           <w:rFonts w:ascii="David" w:cs="David" w:eastAsia="David" w:hAnsi="David"/>
           <w:i w:val="false"/>
           <w:smallCaps w:val="false"/>
+          <w:noProof/>
           <w:sz w:val="26"/>
           <w:szCs w:val="26"/>
           <w:rtl/>
@@ -89,6 +93,7 @@
           <w:bCs/>
           <w:i w:val="false"/>
           <w:smallCaps w:val="false"/>
+          <w:noProof/>
           <w:sz w:val="44"/>
           <w:szCs w:val="44"/>
           <w:rtl/>
@@ -107,6 +112,7 @@
           <w:rFonts w:ascii="David" w:cs="David" w:eastAsia="David" w:hAnsi="David"/>
           <w:i w:val="false"/>
           <w:smallCaps w:val="false"/>
+          <w:noProof/>
           <w:sz w:val="28"/>
           <w:szCs w:val="28"/>
           <w:rtl/>
@@ -125,6 +131,7 @@
           <w:rFonts w:ascii="David" w:cs="David" w:eastAsia="David" w:hAnsi="David"/>
           <w:i w:val="false"/>
           <w:smallCaps w:val="false"/>
+          <w:noProof/>
           <w:sz w:val="26"/>
           <w:szCs w:val="26"/>
           <w:rtl/>
@@ -143,6 +150,7 @@
           <w:rFonts w:ascii="David" w:cs="David" w:eastAsia="David" w:hAnsi="David"/>
           <w:i w:val="false"/>
           <w:smallCaps w:val="false"/>
+          <w:noProof/>
           <w:sz w:val="26"/>
           <w:szCs w:val="26"/>
           <w:rtl/>
@@ -161,6 +169,7 @@
           <w:rFonts w:ascii="David" w:cs="David" w:eastAsia="David" w:hAnsi="David"/>
           <w:i w:val="false"/>
           <w:smallCaps w:val="false"/>
+          <w:noProof/>
           <w:sz w:val="26"/>
           <w:szCs w:val="26"/>
           <w:rtl/>
@@ -179,6 +188,7 @@
           <w:rFonts w:ascii="David" w:cs="David" w:eastAsia="David" w:hAnsi="David"/>
           <w:i w:val="false"/>
           <w:smallCaps w:val="false"/>
+          <w:noProof/>
           <w:sz w:val="26"/>
           <w:szCs w:val="26"/>
           <w:rtl/>
@@ -210,6 +220,7 @@
           <w:bCs/>
           <w:i w:val="false"/>
           <w:smallCaps w:val="false"/>
+          <w:noProof/>
           <w:sz w:val="32"/>
           <w:szCs w:val="32"/>
           <w:rtl/>
@@ -244,6 +255,7 @@
               <w:rFonts w:ascii="David" w:hAnsi="David" w:cs="David" w:eastAsia="David"/>
               <w:b/>
               <w:bCs/>
+              <w:noProof/>
               <w:sz w:val="24"/>
               <w:szCs w:val="24"/>
               <w:rtl/>
@@ -255,6 +267,7 @@
               <w:rFonts w:ascii="David" w:hAnsi="David" w:cs="David" w:eastAsia="David"/>
               <w:b/>
               <w:bCs/>
+              <w:noProof/>
               <w:sz w:val="24"/>
               <w:szCs w:val="24"/>
               <w:rtl/>
@@ -266,6 +279,7 @@
               <w:rFonts w:ascii="David" w:hAnsi="David" w:cs="David" w:eastAsia="David"/>
               <w:b/>
               <w:bCs/>
+              <w:noProof/>
               <w:sz w:val="24"/>
               <w:szCs w:val="24"/>
               <w:rtl/>
@@ -286,6 +300,7 @@
               <w:rFonts w:ascii="David" w:hAnsi="David" w:cs="David" w:eastAsia="David"/>
               <w:b/>
               <w:bCs/>
+              <w:noProof/>
               <w:sz w:val="24"/>
               <w:szCs w:val="24"/>
               <w:rtl/>
@@ -297,6 +312,7 @@
               <w:rFonts w:ascii="David" w:hAnsi="David" w:cs="David" w:eastAsia="David"/>
               <w:b/>
               <w:bCs/>
+              <w:noProof/>
               <w:sz w:val="24"/>
               <w:szCs w:val="24"/>
               <w:rtl/>
@@ -308,6 +324,7 @@
               <w:rFonts w:ascii="David" w:hAnsi="David" w:cs="David" w:eastAsia="David"/>
               <w:b/>
               <w:bCs/>
+              <w:noProof/>
               <w:sz w:val="24"/>
               <w:szCs w:val="24"/>
               <w:rtl/>
@@ -328,6 +345,7 @@
               <w:rFonts w:ascii="David" w:hAnsi="David" w:cs="David" w:eastAsia="David"/>
               <w:b/>
               <w:bCs/>
+              <w:noProof/>
               <w:sz w:val="24"/>
               <w:szCs w:val="24"/>
               <w:rtl/>
@@ -339,6 +357,7 @@
               <w:rFonts w:ascii="David" w:hAnsi="David" w:cs="David" w:eastAsia="David"/>
               <w:b/>
               <w:bCs/>
+              <w:noProof/>
               <w:sz w:val="24"/>
               <w:szCs w:val="24"/>
               <w:rtl/>
@@ -350,6 +369,7 @@
               <w:rFonts w:ascii="David" w:hAnsi="David" w:cs="David" w:eastAsia="David"/>
               <w:b/>
               <w:bCs/>
+              <w:noProof/>
               <w:sz w:val="24"/>
               <w:szCs w:val="24"/>
               <w:rtl/>
@@ -370,6 +390,7 @@
               <w:rFonts w:ascii="David" w:hAnsi="David" w:cs="David" w:eastAsia="David"/>
               <w:b/>
               <w:bCs/>
+              <w:noProof/>
               <w:sz w:val="24"/>
               <w:szCs w:val="24"/>
               <w:rtl/>
@@ -381,6 +402,7 @@
               <w:rFonts w:ascii="David" w:hAnsi="David" w:cs="David" w:eastAsia="David"/>
               <w:b/>
               <w:bCs/>
+              <w:noProof/>
               <w:sz w:val="24"/>
               <w:szCs w:val="24"/>
               <w:rtl/>
@@ -392,6 +414,7 @@
               <w:rFonts w:ascii="David" w:hAnsi="David" w:cs="David" w:eastAsia="David"/>
               <w:b/>
               <w:bCs/>
+              <w:noProof/>
               <w:sz w:val="24"/>
               <w:szCs w:val="24"/>
               <w:rtl/>
@@ -411,6 +434,7 @@
           <w:r>
             <w:rPr>
               <w:rFonts w:ascii="David" w:hAnsi="David" w:cs="David" w:eastAsia="David"/>
+              <w:noProof/>
               <w:sz w:val="24"/>
               <w:szCs w:val="24"/>
               <w:rtl/>
@@ -420,6 +444,7 @@
           <w:r>
             <w:rPr>
               <w:rFonts w:ascii="David" w:hAnsi="David" w:cs="David" w:eastAsia="David"/>
+              <w:noProof/>
               <w:sz w:val="24"/>
               <w:szCs w:val="24"/>
               <w:rtl/>
@@ -429,6 +454,7 @@
           <w:r>
             <w:rPr>
               <w:rFonts w:ascii="David" w:hAnsi="David" w:cs="David" w:eastAsia="David"/>
+              <w:noProof/>
               <w:sz w:val="24"/>
               <w:szCs w:val="24"/>
               <w:rtl/>
@@ -448,6 +474,7 @@
           <w:r>
             <w:rPr>
               <w:rFonts w:ascii="David" w:hAnsi="David" w:cs="David" w:eastAsia="David"/>
+              <w:noProof/>
               <w:sz w:val="24"/>
               <w:szCs w:val="24"/>
               <w:rtl/>
@@ -457,6 +484,7 @@
           <w:r>
             <w:rPr>
               <w:rFonts w:ascii="David" w:hAnsi="David" w:cs="David" w:eastAsia="David"/>
+              <w:noProof/>
               <w:sz w:val="24"/>
               <w:szCs w:val="24"/>
               <w:rtl/>
@@ -466,6 +494,7 @@
           <w:r>
             <w:rPr>
               <w:rFonts w:ascii="David" w:hAnsi="David" w:cs="David" w:eastAsia="David"/>
+              <w:noProof/>
               <w:sz w:val="24"/>
               <w:szCs w:val="24"/>
               <w:rtl/>
@@ -485,6 +514,7 @@
           <w:r>
             <w:rPr>
               <w:rFonts w:ascii="David" w:hAnsi="David" w:cs="David" w:eastAsia="David"/>
+              <w:noProof/>
               <w:sz w:val="24"/>
               <w:szCs w:val="24"/>
               <w:rtl/>
@@ -494,6 +524,7 @@
           <w:r>
             <w:rPr>
               <w:rFonts w:ascii="David" w:hAnsi="David" w:cs="David" w:eastAsia="David"/>
+              <w:noProof/>
               <w:sz w:val="24"/>
               <w:szCs w:val="24"/>
               <w:rtl/>
@@ -503,6 +534,7 @@
           <w:r>
             <w:rPr>
               <w:rFonts w:ascii="David" w:hAnsi="David" w:cs="David" w:eastAsia="David"/>
+              <w:noProof/>
               <w:sz w:val="24"/>
               <w:szCs w:val="24"/>
               <w:rtl/>
@@ -522,6 +554,7 @@
           <w:r>
             <w:rPr>
               <w:rFonts w:ascii="David" w:hAnsi="David" w:cs="David" w:eastAsia="David"/>
+              <w:noProof/>
               <w:sz w:val="24"/>
               <w:szCs w:val="24"/>
               <w:rtl/>
@@ -531,6 +564,7 @@
           <w:r>
             <w:rPr>
               <w:rFonts w:ascii="David" w:hAnsi="David" w:cs="David" w:eastAsia="David"/>
+              <w:noProof/>
               <w:sz w:val="24"/>
               <w:szCs w:val="24"/>
               <w:rtl/>
@@ -540,6 +574,7 @@
           <w:r>
             <w:rPr>
               <w:rFonts w:ascii="David" w:hAnsi="David" w:cs="David" w:eastAsia="David"/>
+              <w:noProof/>
               <w:sz w:val="24"/>
               <w:szCs w:val="24"/>
               <w:rtl/>
@@ -560,6 +595,7 @@
               <w:rFonts w:ascii="David" w:hAnsi="David" w:cs="David" w:eastAsia="David"/>
               <w:b/>
               <w:bCs/>
+              <w:noProof/>
               <w:sz w:val="24"/>
               <w:szCs w:val="24"/>
               <w:rtl/>
@@ -571,6 +607,7 @@
               <w:rFonts w:ascii="David" w:hAnsi="David" w:cs="David" w:eastAsia="David"/>
               <w:b/>
               <w:bCs/>
+              <w:noProof/>
               <w:sz w:val="24"/>
               <w:szCs w:val="24"/>
               <w:rtl/>
@@ -582,6 +619,7 @@
               <w:rFonts w:ascii="David" w:hAnsi="David" w:cs="David" w:eastAsia="David"/>
               <w:b/>
               <w:bCs/>
+              <w:noProof/>
               <w:sz w:val="24"/>
               <w:szCs w:val="24"/>
               <w:rtl/>
@@ -602,6 +640,7 @@
               <w:rFonts w:ascii="David" w:hAnsi="David" w:cs="David" w:eastAsia="David"/>
               <w:b/>
               <w:bCs/>
+              <w:noProof/>
               <w:sz w:val="24"/>
               <w:szCs w:val="24"/>
               <w:rtl/>
@@ -613,6 +652,7 @@
               <w:rFonts w:ascii="David" w:hAnsi="David" w:cs="David" w:eastAsia="David"/>
               <w:b/>
               <w:bCs/>
+              <w:noProof/>
               <w:sz w:val="24"/>
               <w:szCs w:val="24"/>
               <w:rtl/>
@@ -624,6 +664,7 @@
               <w:rFonts w:ascii="David" w:hAnsi="David" w:cs="David" w:eastAsia="David"/>
               <w:b/>
               <w:bCs/>
+              <w:noProof/>
               <w:sz w:val="24"/>
               <w:szCs w:val="24"/>
               <w:rtl/>
@@ -644,6 +685,7 @@
               <w:rFonts w:ascii="David" w:hAnsi="David" w:cs="David" w:eastAsia="David"/>
               <w:b/>
               <w:bCs/>
+              <w:noProof/>
               <w:sz w:val="24"/>
               <w:szCs w:val="24"/>
               <w:rtl/>
@@ -655,6 +697,7 @@
               <w:rFonts w:ascii="David" w:hAnsi="David" w:cs="David" w:eastAsia="David"/>
               <w:b/>
               <w:bCs/>
+              <w:noProof/>
               <w:sz w:val="24"/>
               <w:szCs w:val="24"/>
               <w:rtl/>
@@ -666,6 +709,7 @@
               <w:rFonts w:ascii="David" w:hAnsi="David" w:cs="David" w:eastAsia="David"/>
               <w:b/>
               <w:bCs/>
+              <w:noProof/>
               <w:sz w:val="24"/>
               <w:szCs w:val="24"/>
               <w:rtl/>
@@ -685,6 +729,7 @@
           <w:r>
             <w:rPr>
               <w:rFonts w:ascii="David" w:hAnsi="David" w:cs="David" w:eastAsia="David"/>
+              <w:noProof/>
               <w:sz w:val="24"/>
               <w:szCs w:val="24"/>
               <w:rtl/>
@@ -694,6 +739,7 @@
           <w:r>
             <w:rPr>
               <w:rFonts w:ascii="David" w:hAnsi="David" w:cs="David" w:eastAsia="David"/>
+              <w:noProof/>
               <w:sz w:val="24"/>
               <w:szCs w:val="24"/>
               <w:rtl/>
@@ -703,6 +749,7 @@
           <w:r>
             <w:rPr>
               <w:rFonts w:ascii="David" w:hAnsi="David" w:cs="David" w:eastAsia="David"/>
+              <w:noProof/>
               <w:sz w:val="24"/>
               <w:szCs w:val="24"/>
               <w:rtl/>
@@ -722,6 +769,7 @@
           <w:r>
             <w:rPr>
               <w:rFonts w:ascii="David" w:hAnsi="David" w:cs="David" w:eastAsia="David"/>
+              <w:noProof/>
               <w:sz w:val="24"/>
               <w:szCs w:val="24"/>
               <w:rtl/>
@@ -731,6 +779,7 @@
           <w:r>
             <w:rPr>
               <w:rFonts w:ascii="David" w:hAnsi="David" w:cs="David" w:eastAsia="David"/>
+              <w:noProof/>
               <w:sz w:val="24"/>
               <w:szCs w:val="24"/>
               <w:rtl/>
@@ -740,6 +789,7 @@
           <w:r>
             <w:rPr>
               <w:rFonts w:ascii="David" w:hAnsi="David" w:cs="David" w:eastAsia="David"/>
+              <w:noProof/>
               <w:sz w:val="24"/>
               <w:szCs w:val="24"/>
               <w:rtl/>
@@ -759,6 +809,7 @@
           <w:r>
             <w:rPr>
               <w:rFonts w:ascii="David" w:hAnsi="David" w:cs="David" w:eastAsia="David"/>
+              <w:noProof/>
               <w:sz w:val="24"/>
               <w:szCs w:val="24"/>
               <w:rtl/>
@@ -768,6 +819,7 @@
           <w:r>
             <w:rPr>
               <w:rFonts w:ascii="David" w:hAnsi="David" w:cs="David" w:eastAsia="David"/>
+              <w:noProof/>
               <w:sz w:val="24"/>
               <w:szCs w:val="24"/>
               <w:rtl/>
@@ -777,6 +829,7 @@
           <w:r>
             <w:rPr>
               <w:rFonts w:ascii="David" w:hAnsi="David" w:cs="David" w:eastAsia="David"/>
+              <w:noProof/>
               <w:sz w:val="24"/>
               <w:szCs w:val="24"/>
               <w:rtl/>
@@ -796,6 +849,7 @@
           <w:r>
             <w:rPr>
               <w:rFonts w:ascii="David" w:hAnsi="David" w:cs="David" w:eastAsia="David"/>
+              <w:noProof/>
               <w:sz w:val="24"/>
               <w:szCs w:val="24"/>
               <w:rtl/>
@@ -805,6 +859,7 @@
           <w:r>
             <w:rPr>
               <w:rFonts w:ascii="David" w:hAnsi="David" w:cs="David" w:eastAsia="David"/>
+              <w:noProof/>
               <w:sz w:val="24"/>
               <w:szCs w:val="24"/>
               <w:rtl/>
@@ -814,6 +869,7 @@
           <w:r>
             <w:rPr>
               <w:rFonts w:ascii="David" w:hAnsi="David" w:cs="David" w:eastAsia="David"/>
+              <w:noProof/>
               <w:sz w:val="24"/>
               <w:szCs w:val="24"/>
               <w:rtl/>
@@ -834,6 +890,7 @@
               <w:rFonts w:ascii="David" w:hAnsi="David" w:cs="David" w:eastAsia="David"/>
               <w:b/>
               <w:bCs/>
+              <w:noProof/>
               <w:sz w:val="24"/>
               <w:szCs w:val="24"/>
               <w:rtl/>
@@ -845,6 +902,7 @@
               <w:rFonts w:ascii="David" w:hAnsi="David" w:cs="David" w:eastAsia="David"/>
               <w:b/>
               <w:bCs/>
+              <w:noProof/>
               <w:sz w:val="24"/>
               <w:szCs w:val="24"/>
               <w:rtl/>
@@ -856,6 +914,7 @@
               <w:rFonts w:ascii="David" w:hAnsi="David" w:cs="David" w:eastAsia="David"/>
               <w:b/>
               <w:bCs/>
+              <w:noProof/>
               <w:sz w:val="24"/>
               <w:szCs w:val="24"/>
               <w:rtl/>
@@ -876,6 +935,7 @@
               <w:rFonts w:ascii="David" w:hAnsi="David" w:cs="David" w:eastAsia="David"/>
               <w:b/>
               <w:bCs/>
+              <w:noProof/>
               <w:sz w:val="24"/>
               <w:szCs w:val="24"/>
               <w:rtl/>
@@ -887,6 +947,7 @@
               <w:rFonts w:ascii="David" w:hAnsi="David" w:cs="David" w:eastAsia="David"/>
               <w:b/>
               <w:bCs/>
+              <w:noProof/>
               <w:sz w:val="24"/>
               <w:szCs w:val="24"/>
               <w:rtl/>
@@ -898,6 +959,7 @@
               <w:rFonts w:ascii="David" w:hAnsi="David" w:cs="David" w:eastAsia="David"/>
               <w:b/>
               <w:bCs/>
+              <w:noProof/>
               <w:sz w:val="24"/>
               <w:szCs w:val="24"/>
               <w:rtl/>
@@ -941,6 +1003,7 @@
           <w:bCs/>
           <w:i w:val="false"/>
           <w:smallCaps w:val="false"/>
+          <w:noProof/>
           <w:sz w:val="28"/>
           <w:szCs w:val="28"/>
           <w:rtl/>
@@ -960,6 +1023,7 @@
           <w:rFonts w:ascii="David" w:cs="David" w:eastAsia="David" w:hAnsi="David"/>
           <w:i w:val="false"/>
           <w:smallCaps w:val="false"/>
+          <w:noProof/>
           <w:sz w:val="24"/>
           <w:szCs w:val="24"/>
           <w:rtl/>
@@ -969,6 +1033,7 @@
       <w:r>
         <w:rPr>
           <w:rStyle w:val="FootnoteReference"/>
+          <w:noProof/>
         </w:rPr>
         <w:footnoteReference w:id="1"/>
       </w:r>
@@ -977,6 +1042,7 @@
           <w:rFonts w:ascii="David" w:cs="David" w:eastAsia="David" w:hAnsi="David"/>
           <w:i w:val="false"/>
           <w:smallCaps w:val="false"/>
+          <w:noProof/>
           <w:sz w:val="24"/>
           <w:szCs w:val="24"/>
           <w:rtl/>
@@ -996,6 +1062,7 @@
           <w:rFonts w:ascii="David" w:cs="David" w:eastAsia="David" w:hAnsi="David"/>
           <w:i w:val="false"/>
           <w:smallCaps w:val="false"/>
+          <w:noProof/>
           <w:sz w:val="24"/>
           <w:szCs w:val="24"/>
           <w:rtl/>
@@ -1015,6 +1082,7 @@
           <w:rFonts w:ascii="David" w:cs="David" w:eastAsia="David" w:hAnsi="David"/>
           <w:i w:val="false"/>
           <w:smallCaps w:val="false"/>
+          <w:noProof/>
           <w:sz w:val="24"/>
           <w:szCs w:val="24"/>
           <w:rtl/>
@@ -1034,6 +1102,7 @@
           <w:rFonts w:ascii="David" w:cs="David" w:eastAsia="David" w:hAnsi="David"/>
           <w:i w:val="false"/>
           <w:smallCaps w:val="false"/>
+          <w:noProof/>
           <w:sz w:val="24"/>
           <w:szCs w:val="24"/>
           <w:rtl/>
@@ -1056,6 +1125,7 @@
           <w:bCs/>
           <w:i w:val="false"/>
           <w:smallCaps w:val="false"/>
+          <w:noProof/>
           <w:sz w:val="28"/>
           <w:szCs w:val="28"/>
           <w:rtl/>
@@ -1075,6 +1145,7 @@
           <w:rFonts w:ascii="David" w:cs="David" w:eastAsia="David" w:hAnsi="David"/>
           <w:i w:val="false"/>
           <w:smallCaps w:val="false"/>
+          <w:noProof/>
           <w:sz w:val="24"/>
           <w:szCs w:val="24"/>
           <w:rtl/>
@@ -1084,6 +1155,7 @@
       <w:r>
         <w:rPr>
           <w:rStyle w:val="FootnoteReference"/>
+          <w:noProof/>
         </w:rPr>
         <w:footnoteReference w:id="2"/>
       </w:r>
@@ -1092,6 +1164,7 @@
           <w:rFonts w:ascii="David" w:cs="David" w:eastAsia="David" w:hAnsi="David"/>
           <w:i w:val="false"/>
           <w:smallCaps w:val="false"/>
+          <w:noProof/>
           <w:sz w:val="24"/>
           <w:szCs w:val="24"/>
           <w:rtl/>
@@ -1101,6 +1174,7 @@
       <w:r>
         <w:rPr>
           <w:rStyle w:val="FootnoteReference"/>
+          <w:noProof/>
         </w:rPr>
         <w:footnoteReference w:id="3"/>
       </w:r>
@@ -1109,6 +1183,7 @@
           <w:rFonts w:ascii="David" w:cs="David" w:eastAsia="David" w:hAnsi="David"/>
           <w:i w:val="false"/>
           <w:smallCaps w:val="false"/>
+          <w:noProof/>
           <w:sz w:val="24"/>
           <w:szCs w:val="24"/>
           <w:rtl/>
@@ -1118,6 +1193,7 @@
       <w:r>
         <w:rPr>
           <w:rStyle w:val="FootnoteReference"/>
+          <w:noProof/>
         </w:rPr>
         <w:footnoteReference w:id="4"/>
       </w:r>
@@ -1134,6 +1210,7 @@
           <w:rFonts w:ascii="David" w:cs="David" w:eastAsia="David" w:hAnsi="David"/>
           <w:i w:val="false"/>
           <w:smallCaps w:val="false"/>
+          <w:noProof/>
           <w:sz w:val="24"/>
           <w:szCs w:val="24"/>
           <w:rtl/>
@@ -1143,6 +1220,7 @@
       <w:r>
         <w:rPr>
           <w:rStyle w:val="FootnoteReference"/>
+          <w:noProof/>
         </w:rPr>
         <w:footnoteReference w:id="5"/>
       </w:r>
@@ -1151,6 +1229,7 @@
           <w:rFonts w:ascii="David" w:cs="David" w:eastAsia="David" w:hAnsi="David"/>
           <w:i w:val="false"/>
           <w:smallCaps w:val="false"/>
+          <w:noProof/>
           <w:sz w:val="24"/>
           <w:szCs w:val="24"/>
           <w:rtl/>
@@ -1160,6 +1239,7 @@
       <w:r>
         <w:rPr>
           <w:rStyle w:val="FootnoteReference"/>
+          <w:noProof/>
         </w:rPr>
         <w:footnoteReference w:id="6"/>
       </w:r>
@@ -1179,6 +1259,7 @@
           <w:bCs/>
           <w:i w:val="false"/>
           <w:smallCaps w:val="false"/>
+          <w:noProof/>
           <w:sz w:val="28"/>
           <w:szCs w:val="28"/>
           <w:rtl/>
@@ -1198,6 +1279,7 @@
           <w:rFonts w:ascii="David" w:cs="David" w:eastAsia="David" w:hAnsi="David"/>
           <w:i w:val="false"/>
           <w:smallCaps w:val="false"/>
+          <w:noProof/>
           <w:sz w:val="24"/>
           <w:szCs w:val="24"/>
           <w:rtl/>
@@ -1207,6 +1289,7 @@
       <w:r>
         <w:rPr>
           <w:rStyle w:val="FootnoteReference"/>
+          <w:noProof/>
         </w:rPr>
         <w:footnoteReference w:id="7"/>
       </w:r>
@@ -1215,6 +1298,7 @@
           <w:rFonts w:ascii="David" w:cs="David" w:eastAsia="David" w:hAnsi="David"/>
           <w:i w:val="false"/>
           <w:smallCaps w:val="false"/>
+          <w:noProof/>
           <w:sz w:val="24"/>
           <w:szCs w:val="24"/>
           <w:rtl/>
@@ -1224,6 +1308,7 @@
       <w:r>
         <w:rPr>
           <w:rStyle w:val="FootnoteReference"/>
+          <w:noProof/>
         </w:rPr>
         <w:footnoteReference w:id="8"/>
       </w:r>
@@ -1240,6 +1325,7 @@
           <w:rFonts w:ascii="David" w:cs="David" w:eastAsia="David" w:hAnsi="David"/>
           <w:i w:val="false"/>
           <w:smallCaps w:val="false"/>
+          <w:noProof/>
           <w:sz w:val="24"/>
           <w:szCs w:val="24"/>
           <w:rtl/>
@@ -1249,6 +1335,7 @@
       <w:r>
         <w:rPr>
           <w:rStyle w:val="FootnoteReference"/>
+          <w:noProof/>
         </w:rPr>
         <w:footnoteReference w:id="9"/>
       </w:r>
@@ -1257,6 +1344,7 @@
           <w:rFonts w:ascii="David" w:cs="David" w:eastAsia="David" w:hAnsi="David"/>
           <w:i w:val="false"/>
           <w:smallCaps w:val="false"/>
+          <w:noProof/>
           <w:sz w:val="24"/>
           <w:szCs w:val="24"/>
           <w:rtl/>
@@ -1276,6 +1364,7 @@
           <w:rFonts w:ascii="David" w:cs="David" w:eastAsia="David" w:hAnsi="David"/>
           <w:i w:val="false"/>
           <w:smallCaps w:val="false"/>
+          <w:noProof/>
           <w:sz w:val="24"/>
           <w:szCs w:val="24"/>
           <w:rtl/>
@@ -1285,6 +1374,7 @@
       <w:r>
         <w:rPr>
           <w:rStyle w:val="FootnoteReference"/>
+          <w:noProof/>
         </w:rPr>
         <w:footnoteReference w:id="10"/>
       </w:r>
@@ -1293,6 +1383,7 @@
           <w:rFonts w:ascii="David" w:cs="David" w:eastAsia="David" w:hAnsi="David"/>
           <w:i w:val="false"/>
           <w:smallCaps w:val="false"/>
+          <w:noProof/>
           <w:sz w:val="24"/>
           <w:szCs w:val="24"/>
           <w:rtl/>
@@ -1302,6 +1393,7 @@
       <w:r>
         <w:rPr>
           <w:rStyle w:val="FootnoteReference"/>
+          <w:noProof/>
         </w:rPr>
         <w:footnoteReference w:id="11"/>
       </w:r>
@@ -1318,6 +1410,7 @@
           <w:rFonts w:ascii="David" w:cs="David" w:eastAsia="David" w:hAnsi="David"/>
           <w:i w:val="false"/>
           <w:smallCaps w:val="false"/>
+          <w:noProof/>
           <w:sz w:val="24"/>
           <w:szCs w:val="24"/>
           <w:rtl/>
@@ -1327,6 +1420,7 @@
       <w:r>
         <w:rPr>
           <w:rStyle w:val="FootnoteReference"/>
+          <w:noProof/>
         </w:rPr>
         <w:footnoteReference w:id="12"/>
       </w:r>
@@ -1335,6 +1429,7 @@
           <w:rFonts w:ascii="David" w:cs="David" w:eastAsia="David" w:hAnsi="David"/>
           <w:i w:val="false"/>
           <w:smallCaps w:val="false"/>
+          <w:noProof/>
           <w:sz w:val="24"/>
           <w:szCs w:val="24"/>
           <w:rtl/>
@@ -1344,6 +1439,7 @@
       <w:r>
         <w:rPr>
           <w:rStyle w:val="FootnoteReference"/>
+          <w:noProof/>
         </w:rPr>
         <w:footnoteReference w:id="13"/>
       </w:r>
@@ -1352,6 +1448,7 @@
           <w:rFonts w:ascii="David" w:cs="David" w:eastAsia="David" w:hAnsi="David"/>
           <w:i w:val="false"/>
           <w:smallCaps w:val="false"/>
+          <w:noProof/>
           <w:sz w:val="24"/>
           <w:szCs w:val="24"/>
           <w:rtl/>
@@ -1361,6 +1458,7 @@
       <w:r>
         <w:rPr>
           <w:rStyle w:val="FootnoteReference"/>
+          <w:noProof/>
         </w:rPr>
         <w:footnoteReference w:id="14"/>
       </w:r>
@@ -1380,6 +1478,7 @@
           <w:bCs/>
           <w:i w:val="false"/>
           <w:smallCaps w:val="false"/>
+          <w:noProof/>
           <w:sz w:val="28"/>
           <w:szCs w:val="28"/>
           <w:rtl/>
@@ -1402,6 +1501,7 @@
           <w:bCs/>
           <w:i w:val="false"/>
           <w:smallCaps w:val="false"/>
+          <w:noProof/>
           <w:sz w:val="24"/>
           <w:szCs w:val="24"/>
           <w:rtl/>
@@ -1421,6 +1521,7 @@
           <w:rFonts w:ascii="David" w:cs="David" w:eastAsia="David" w:hAnsi="David"/>
           <w:i w:val="false"/>
           <w:smallCaps w:val="false"/>
+          <w:noProof/>
           <w:sz w:val="24"/>
           <w:szCs w:val="24"/>
           <w:rtl/>
@@ -1430,6 +1531,7 @@
       <w:r>
         <w:rPr>
           <w:rStyle w:val="FootnoteReference"/>
+          <w:noProof/>
         </w:rPr>
         <w:footnoteReference w:id="15"/>
       </w:r>
@@ -1438,6 +1540,7 @@
           <w:rFonts w:ascii="David" w:cs="David" w:eastAsia="David" w:hAnsi="David"/>
           <w:i w:val="false"/>
           <w:smallCaps w:val="false"/>
+          <w:noProof/>
           <w:sz w:val="24"/>
           <w:szCs w:val="24"/>
           <w:rtl/>
@@ -1457,6 +1560,7 @@
           <w:rFonts w:ascii="David" w:cs="David" w:eastAsia="David" w:hAnsi="David"/>
           <w:i w:val="false"/>
           <w:smallCaps w:val="false"/>
+          <w:noProof/>
           <w:sz w:val="24"/>
           <w:szCs w:val="24"/>
           <w:rtl/>
@@ -1466,6 +1570,7 @@
       <w:r>
         <w:rPr>
           <w:rStyle w:val="FootnoteReference"/>
+          <w:noProof/>
         </w:rPr>
         <w:footnoteReference w:id="16"/>
       </w:r>
@@ -1474,6 +1579,7 @@
           <w:rFonts w:ascii="David" w:cs="David" w:eastAsia="David" w:hAnsi="David"/>
           <w:i w:val="false"/>
           <w:smallCaps w:val="false"/>
+          <w:noProof/>
           <w:sz w:val="24"/>
           <w:szCs w:val="24"/>
           <w:rtl/>
@@ -1483,6 +1589,7 @@
       <w:r>
         <w:rPr>
           <w:rStyle w:val="FootnoteReference"/>
+          <w:noProof/>
         </w:rPr>
         <w:footnoteReference w:id="17"/>
       </w:r>
@@ -1491,6 +1598,7 @@
           <w:rFonts w:ascii="David" w:cs="David" w:eastAsia="David" w:hAnsi="David"/>
           <w:i w:val="false"/>
           <w:smallCaps w:val="false"/>
+          <w:noProof/>
           <w:sz w:val="24"/>
           <w:szCs w:val="24"/>
           <w:rtl/>
@@ -1500,6 +1608,7 @@
       <w:r>
         <w:rPr>
           <w:rStyle w:val="FootnoteReference"/>
+          <w:noProof/>
         </w:rPr>
         <w:footnoteReference w:id="18"/>
       </w:r>
@@ -1516,6 +1625,7 @@
           <w:rFonts w:ascii="David" w:cs="David" w:eastAsia="David" w:hAnsi="David"/>
           <w:i w:val="false"/>
           <w:smallCaps w:val="false"/>
+          <w:noProof/>
           <w:sz w:val="24"/>
           <w:szCs w:val="24"/>
           <w:rtl/>
@@ -1525,6 +1635,7 @@
       <w:r>
         <w:rPr>
           <w:rStyle w:val="FootnoteReference"/>
+          <w:noProof/>
         </w:rPr>
         <w:footnoteReference w:id="19"/>
       </w:r>
@@ -1533,6 +1644,7 @@
           <w:rFonts w:ascii="David" w:cs="David" w:eastAsia="David" w:hAnsi="David"/>
           <w:i w:val="false"/>
           <w:smallCaps w:val="false"/>
+          <w:noProof/>
           <w:sz w:val="24"/>
           <w:szCs w:val="24"/>
           <w:rtl/>
@@ -1542,6 +1654,7 @@
       <w:r>
         <w:rPr>
           <w:rStyle w:val="FootnoteReference"/>
+          <w:noProof/>
         </w:rPr>
         <w:footnoteReference w:id="20"/>
       </w:r>
@@ -1550,6 +1663,7 @@
           <w:rFonts w:ascii="David" w:cs="David" w:eastAsia="David" w:hAnsi="David"/>
           <w:i w:val="false"/>
           <w:smallCaps w:val="false"/>
+          <w:noProof/>
           <w:sz w:val="24"/>
           <w:szCs w:val="24"/>
           <w:rtl/>
@@ -1559,6 +1673,7 @@
       <w:r>
         <w:rPr>
           <w:rStyle w:val="FootnoteReference"/>
+          <w:noProof/>
         </w:rPr>
         <w:footnoteReference w:id="21"/>
       </w:r>
@@ -1567,6 +1682,7 @@
           <w:rFonts w:ascii="David" w:cs="David" w:eastAsia="David" w:hAnsi="David"/>
           <w:i w:val="false"/>
           <w:smallCaps w:val="false"/>
+          <w:noProof/>
           <w:sz w:val="24"/>
           <w:szCs w:val="24"/>
           <w:rtl/>
@@ -1586,6 +1702,7 @@
           <w:rFonts w:ascii="David" w:cs="David" w:eastAsia="David" w:hAnsi="David"/>
           <w:i w:val="false"/>
           <w:smallCaps w:val="false"/>
+          <w:noProof/>
           <w:sz w:val="24"/>
           <w:szCs w:val="24"/>
           <w:rtl/>
@@ -1608,6 +1725,7 @@
           <w:bCs/>
           <w:i w:val="false"/>
           <w:smallCaps w:val="false"/>
+          <w:noProof/>
           <w:sz w:val="24"/>
           <w:szCs w:val="24"/>
           <w:rtl/>
@@ -1627,6 +1745,7 @@
           <w:rFonts w:ascii="David" w:cs="David" w:eastAsia="David" w:hAnsi="David"/>
           <w:i w:val="false"/>
           <w:smallCaps w:val="false"/>
+          <w:noProof/>
           <w:sz w:val="24"/>
           <w:szCs w:val="24"/>
           <w:rtl/>
@@ -1636,6 +1755,7 @@
       <w:r>
         <w:rPr>
           <w:rStyle w:val="FootnoteReference"/>
+          <w:noProof/>
         </w:rPr>
         <w:footnoteReference w:id="22"/>
       </w:r>
@@ -1644,6 +1764,7 @@
           <w:rFonts w:ascii="David" w:cs="David" w:eastAsia="David" w:hAnsi="David"/>
           <w:i w:val="false"/>
           <w:smallCaps w:val="false"/>
+          <w:noProof/>
           <w:sz w:val="24"/>
           <w:szCs w:val="24"/>
           <w:rtl/>
@@ -1666,6 +1787,7 @@
           <w:bCs/>
           <w:i w:val="false"/>
           <w:smallCaps w:val="false"/>
+          <w:noProof/>
           <w:sz w:val="24"/>
           <w:szCs w:val="24"/>
           <w:rtl/>
@@ -1685,6 +1807,7 @@
           <w:rFonts w:ascii="David" w:cs="David" w:eastAsia="David" w:hAnsi="David"/>
           <w:i w:val="false"/>
           <w:smallCaps w:val="false"/>
+          <w:noProof/>
           <w:sz w:val="24"/>
           <w:szCs w:val="24"/>
           <w:rtl/>
@@ -1694,6 +1817,7 @@
       <w:r>
         <w:rPr>
           <w:rStyle w:val="FootnoteReference"/>
+          <w:noProof/>
         </w:rPr>
         <w:footnoteReference w:id="23"/>
       </w:r>
@@ -1702,6 +1826,7 @@
           <w:rFonts w:ascii="David" w:cs="David" w:eastAsia="David" w:hAnsi="David"/>
           <w:i w:val="false"/>
           <w:smallCaps w:val="false"/>
+          <w:noProof/>
           <w:sz w:val="24"/>
           <w:szCs w:val="24"/>
           <w:rtl/>
@@ -1711,6 +1836,7 @@
       <w:r>
         <w:rPr>
           <w:rStyle w:val="FootnoteReference"/>
+          <w:noProof/>
         </w:rPr>
         <w:footnoteReference w:id="24"/>
       </w:r>
@@ -1727,6 +1853,7 @@
           <w:rFonts w:ascii="David" w:cs="David" w:eastAsia="David" w:hAnsi="David"/>
           <w:i w:val="false"/>
           <w:smallCaps w:val="false"/>
+          <w:noProof/>
           <w:sz w:val="24"/>
           <w:szCs w:val="24"/>
           <w:rtl/>
@@ -1736,6 +1863,7 @@
       <w:r>
         <w:rPr>
           <w:rStyle w:val="FootnoteReference"/>
+          <w:noProof/>
         </w:rPr>
         <w:footnoteReference w:id="25"/>
       </w:r>
@@ -1744,6 +1872,7 @@
           <w:rFonts w:ascii="David" w:cs="David" w:eastAsia="David" w:hAnsi="David"/>
           <w:i w:val="false"/>
           <w:smallCaps w:val="false"/>
+          <w:noProof/>
           <w:sz w:val="24"/>
           <w:szCs w:val="24"/>
           <w:rtl/>
@@ -1753,6 +1882,7 @@
       <w:r>
         <w:rPr>
           <w:rStyle w:val="FootnoteReference"/>
+          <w:noProof/>
         </w:rPr>
         <w:footnoteReference w:id="26"/>
       </w:r>
@@ -1769,6 +1899,7 @@
           <w:rFonts w:ascii="David" w:cs="David" w:eastAsia="David" w:hAnsi="David"/>
           <w:i w:val="false"/>
           <w:smallCaps w:val="false"/>
+          <w:noProof/>
           <w:sz w:val="24"/>
           <w:szCs w:val="24"/>
           <w:rtl/>
@@ -1778,6 +1909,7 @@
       <w:r>
         <w:rPr>
           <w:rStyle w:val="FootnoteReference"/>
+          <w:noProof/>
         </w:rPr>
         <w:footnoteReference w:id="27"/>
       </w:r>
@@ -1786,6 +1918,7 @@
           <w:rFonts w:ascii="David" w:cs="David" w:eastAsia="David" w:hAnsi="David"/>
           <w:i w:val="false"/>
           <w:smallCaps w:val="false"/>
+          <w:noProof/>
           <w:sz w:val="24"/>
           <w:szCs w:val="24"/>
           <w:rtl/>
@@ -1808,6 +1941,7 @@
           <w:bCs/>
           <w:i w:val="false"/>
           <w:smallCaps w:val="false"/>
+          <w:noProof/>
           <w:sz w:val="24"/>
           <w:szCs w:val="24"/>
           <w:rtl/>
@@ -1827,6 +1961,7 @@
           <w:rFonts w:ascii="David" w:cs="David" w:eastAsia="David" w:hAnsi="David"/>
           <w:i w:val="false"/>
           <w:smallCaps w:val="false"/>
+          <w:noProof/>
           <w:sz w:val="24"/>
           <w:szCs w:val="24"/>
           <w:rtl/>
@@ -1836,6 +1971,7 @@
       <w:r>
         <w:rPr>
           <w:rStyle w:val="FootnoteReference"/>
+          <w:noProof/>
         </w:rPr>
         <w:footnoteReference w:id="28"/>
       </w:r>
@@ -1844,6 +1980,7 @@
           <w:rFonts w:ascii="David" w:cs="David" w:eastAsia="David" w:hAnsi="David"/>
           <w:i w:val="false"/>
           <w:smallCaps w:val="false"/>
+          <w:noProof/>
           <w:sz w:val="24"/>
           <w:szCs w:val="24"/>
           <w:rtl/>
@@ -1853,6 +1990,7 @@
       <w:r>
         <w:rPr>
           <w:rStyle w:val="FootnoteReference"/>
+          <w:noProof/>
         </w:rPr>
         <w:footnoteReference w:id="29"/>
       </w:r>
@@ -1869,6 +2007,7 @@
           <w:rFonts w:ascii="David" w:cs="David" w:eastAsia="David" w:hAnsi="David"/>
           <w:i w:val="false"/>
           <w:smallCaps w:val="false"/>
+          <w:noProof/>
           <w:sz w:val="24"/>
           <w:szCs w:val="24"/>
           <w:rtl/>
@@ -1878,6 +2017,7 @@
       <w:r>
         <w:rPr>
           <w:rStyle w:val="FootnoteReference"/>
+          <w:noProof/>
         </w:rPr>
         <w:footnoteReference w:id="30"/>
       </w:r>
@@ -1886,6 +2026,7 @@
           <w:rFonts w:ascii="David" w:cs="David" w:eastAsia="David" w:hAnsi="David"/>
           <w:i w:val="false"/>
           <w:smallCaps w:val="false"/>
+          <w:noProof/>
           <w:sz w:val="24"/>
           <w:szCs w:val="24"/>
           <w:rtl/>
@@ -1895,6 +2036,7 @@
       <w:r>
         <w:rPr>
           <w:rStyle w:val="FootnoteReference"/>
+          <w:noProof/>
         </w:rPr>
         <w:footnoteReference w:id="31"/>
       </w:r>
@@ -1903,6 +2045,7 @@
           <w:rFonts w:ascii="David" w:cs="David" w:eastAsia="David" w:hAnsi="David"/>
           <w:i w:val="false"/>
           <w:smallCaps w:val="false"/>
+          <w:noProof/>
           <w:sz w:val="24"/>
           <w:szCs w:val="24"/>
           <w:rtl/>
@@ -1912,6 +2055,7 @@
       <w:r>
         <w:rPr>
           <w:rStyle w:val="FootnoteReference"/>
+          <w:noProof/>
         </w:rPr>
         <w:footnoteReference w:id="32"/>
       </w:r>
@@ -1931,6 +2075,7 @@
           <w:bCs/>
           <w:i w:val="false"/>
           <w:smallCaps w:val="false"/>
+          <w:noProof/>
           <w:sz w:val="28"/>
           <w:szCs w:val="28"/>
           <w:rtl/>
@@ -1950,6 +2095,7 @@
           <w:rFonts w:ascii="David" w:cs="David" w:eastAsia="David" w:hAnsi="David"/>
           <w:i w:val="false"/>
           <w:smallCaps w:val="false"/>
+          <w:noProof/>
           <w:sz w:val="24"/>
           <w:szCs w:val="24"/>
           <w:rtl/>
@@ -1959,6 +2105,7 @@
       <w:r>
         <w:rPr>
           <w:rStyle w:val="FootnoteReference"/>
+          <w:noProof/>
         </w:rPr>
         <w:footnoteReference w:id="33"/>
       </w:r>
@@ -1967,6 +2114,7 @@
           <w:rFonts w:ascii="David" w:cs="David" w:eastAsia="David" w:hAnsi="David"/>
           <w:i w:val="false"/>
           <w:smallCaps w:val="false"/>
+          <w:noProof/>
           <w:sz w:val="24"/>
           <w:szCs w:val="24"/>
           <w:rtl/>
@@ -1986,6 +2134,7 @@
           <w:rFonts w:ascii="David" w:cs="David" w:eastAsia="David" w:hAnsi="David"/>
           <w:i w:val="false"/>
           <w:smallCaps w:val="false"/>
+          <w:noProof/>
           <w:sz w:val="24"/>
           <w:szCs w:val="24"/>
           <w:rtl/>
@@ -1995,6 +2144,7 @@
       <w:r>
         <w:rPr>
           <w:rStyle w:val="FootnoteReference"/>
+          <w:noProof/>
         </w:rPr>
         <w:footnoteReference w:id="34"/>
       </w:r>
@@ -2003,6 +2153,7 @@
           <w:rFonts w:ascii="David" w:cs="David" w:eastAsia="David" w:hAnsi="David"/>
           <w:i w:val="false"/>
           <w:smallCaps w:val="false"/>
+          <w:noProof/>
           <w:sz w:val="24"/>
           <w:szCs w:val="24"/>
           <w:rtl/>
@@ -2012,6 +2163,7 @@
       <w:r>
         <w:rPr>
           <w:rStyle w:val="FootnoteReference"/>
+          <w:noProof/>
         </w:rPr>
         <w:footnoteReference w:id="35"/>
       </w:r>
@@ -2028,6 +2180,7 @@
           <w:rFonts w:ascii="David" w:cs="David" w:eastAsia="David" w:hAnsi="David"/>
           <w:i w:val="false"/>
           <w:smallCaps w:val="false"/>
+          <w:noProof/>
           <w:sz w:val="24"/>
           <w:szCs w:val="24"/>
           <w:rtl/>
@@ -2037,6 +2190,7 @@
       <w:r>
         <w:rPr>
           <w:rStyle w:val="FootnoteReference"/>
+          <w:noProof/>
         </w:rPr>
         <w:footnoteReference w:id="36"/>
       </w:r>
@@ -2045,6 +2199,7 @@
           <w:rFonts w:ascii="David" w:cs="David" w:eastAsia="David" w:hAnsi="David"/>
           <w:i w:val="false"/>
           <w:smallCaps w:val="false"/>
+          <w:noProof/>
           <w:sz w:val="24"/>
           <w:szCs w:val="24"/>
           <w:rtl/>
@@ -2054,6 +2209,7 @@
       <w:r>
         <w:rPr>
           <w:rStyle w:val="FootnoteReference"/>
+          <w:noProof/>
         </w:rPr>
         <w:footnoteReference w:id="37"/>
       </w:r>
@@ -2062,6 +2218,7 @@
           <w:rFonts w:ascii="David" w:cs="David" w:eastAsia="David" w:hAnsi="David"/>
           <w:i w:val="false"/>
           <w:smallCaps w:val="false"/>
+          <w:noProof/>
           <w:sz w:val="24"/>
           <w:szCs w:val="24"/>
           <w:rtl/>
@@ -2071,6 +2228,7 @@
       <w:r>
         <w:rPr>
           <w:rStyle w:val="FootnoteReference"/>
+          <w:noProof/>
         </w:rPr>
         <w:footnoteReference w:id="38"/>
       </w:r>
@@ -2087,6 +2245,7 @@
           <w:rFonts w:ascii="David" w:cs="David" w:eastAsia="David" w:hAnsi="David"/>
           <w:i w:val="false"/>
           <w:smallCaps w:val="false"/>
+          <w:noProof/>
           <w:sz w:val="24"/>
           <w:szCs w:val="24"/>
           <w:rtl/>
@@ -2096,6 +2255,7 @@
       <w:r>
         <w:rPr>
           <w:rStyle w:val="FootnoteReference"/>
+          <w:noProof/>
         </w:rPr>
         <w:footnoteReference w:id="39"/>
       </w:r>
@@ -2112,6 +2272,7 @@
           <w:rFonts w:ascii="David" w:cs="David" w:eastAsia="David" w:hAnsi="David"/>
           <w:i w:val="false"/>
           <w:smallCaps w:val="false"/>
+          <w:noProof/>
           <w:sz w:val="24"/>
           <w:szCs w:val="24"/>
           <w:rtl/>
@@ -2121,6 +2282,7 @@
       <w:r>
         <w:rPr>
           <w:rStyle w:val="FootnoteReference"/>
+          <w:noProof/>
         </w:rPr>
         <w:footnoteReference w:id="40"/>
       </w:r>
@@ -2129,6 +2291,7 @@
           <w:rFonts w:ascii="David" w:cs="David" w:eastAsia="David" w:hAnsi="David"/>
           <w:i w:val="false"/>
           <w:smallCaps w:val="false"/>
+          <w:noProof/>
           <w:sz w:val="24"/>
           <w:szCs w:val="24"/>
           <w:rtl/>
@@ -2151,6 +2314,7 @@
           <w:bCs/>
           <w:i w:val="false"/>
           <w:smallCaps w:val="false"/>
+          <w:noProof/>
           <w:sz w:val="28"/>
           <w:szCs w:val="28"/>
           <w:rtl/>
@@ -2170,6 +2334,7 @@
           <w:rFonts w:ascii="David" w:cs="David" w:eastAsia="David" w:hAnsi="David"/>
           <w:i w:val="false"/>
           <w:smallCaps w:val="false"/>
+          <w:noProof/>
           <w:sz w:val="24"/>
           <w:szCs w:val="24"/>
           <w:rtl/>
@@ -2179,6 +2344,7 @@
       <w:r>
         <w:rPr>
           <w:rStyle w:val="FootnoteReference"/>
+          <w:noProof/>
         </w:rPr>
         <w:footnoteReference w:id="41"/>
       </w:r>
@@ -2187,6 +2353,7 @@
           <w:rFonts w:ascii="David" w:cs="David" w:eastAsia="David" w:hAnsi="David"/>
           <w:i w:val="false"/>
           <w:smallCaps w:val="false"/>
+          <w:noProof/>
           <w:sz w:val="24"/>
           <w:szCs w:val="24"/>
           <w:rtl/>
@@ -2196,6 +2363,7 @@
       <w:r>
         <w:rPr>
           <w:rStyle w:val="FootnoteReference"/>
+          <w:noProof/>
         </w:rPr>
         <w:footnoteReference w:id="42"/>
       </w:r>
@@ -2204,6 +2372,7 @@
           <w:rFonts w:ascii="David" w:cs="David" w:eastAsia="David" w:hAnsi="David"/>
           <w:i w:val="false"/>
           <w:smallCaps w:val="false"/>
+          <w:noProof/>
           <w:sz w:val="24"/>
           <w:szCs w:val="24"/>
           <w:rtl/>
@@ -2213,6 +2382,7 @@
       <w:r>
         <w:rPr>
           <w:rStyle w:val="FootnoteReference"/>
+          <w:noProof/>
         </w:rPr>
         <w:footnoteReference w:id="43"/>
       </w:r>
@@ -2221,6 +2391,7 @@
           <w:rFonts w:ascii="David" w:cs="David" w:eastAsia="David" w:hAnsi="David"/>
           <w:i w:val="false"/>
           <w:smallCaps w:val="false"/>
+          <w:noProof/>
           <w:sz w:val="24"/>
           <w:szCs w:val="24"/>
           <w:rtl/>
@@ -2230,6 +2401,7 @@
       <w:r>
         <w:rPr>
           <w:rStyle w:val="FootnoteReference"/>
+          <w:noProof/>
         </w:rPr>
         <w:footnoteReference w:id="44"/>
       </w:r>
@@ -2246,6 +2418,7 @@
           <w:rFonts w:ascii="David" w:cs="David" w:eastAsia="David" w:hAnsi="David"/>
           <w:i w:val="false"/>
           <w:smallCaps w:val="false"/>
+          <w:noProof/>
           <w:sz w:val="24"/>
           <w:szCs w:val="24"/>
           <w:rtl/>
@@ -2255,6 +2428,7 @@
       <w:r>
         <w:rPr>
           <w:rStyle w:val="FootnoteReference"/>
+          <w:noProof/>
         </w:rPr>
         <w:footnoteReference w:id="45"/>
       </w:r>
@@ -2263,6 +2437,7 @@
           <w:rFonts w:ascii="David" w:cs="David" w:eastAsia="David" w:hAnsi="David"/>
           <w:i w:val="false"/>
           <w:smallCaps w:val="false"/>
+          <w:noProof/>
           <w:sz w:val="24"/>
           <w:szCs w:val="24"/>
           <w:rtl/>
@@ -2272,6 +2447,7 @@
       <w:r>
         <w:rPr>
           <w:rStyle w:val="FootnoteReference"/>
+          <w:noProof/>
         </w:rPr>
         <w:footnoteReference w:id="46"/>
       </w:r>
@@ -2280,6 +2456,7 @@
           <w:rFonts w:ascii="David" w:cs="David" w:eastAsia="David" w:hAnsi="David"/>
           <w:i w:val="false"/>
           <w:smallCaps w:val="false"/>
+          <w:noProof/>
           <w:sz w:val="24"/>
           <w:szCs w:val="24"/>
           <w:rtl/>
@@ -2299,6 +2476,7 @@
           <w:rFonts w:ascii="David" w:cs="David" w:eastAsia="David" w:hAnsi="David"/>
           <w:i w:val="false"/>
           <w:smallCaps w:val="false"/>
+          <w:noProof/>
           <w:sz w:val="24"/>
           <w:szCs w:val="24"/>
           <w:rtl/>
@@ -2308,6 +2486,7 @@
       <w:r>
         <w:rPr>
           <w:rStyle w:val="FootnoteReference"/>
+          <w:noProof/>
         </w:rPr>
         <w:footnoteReference w:id="47"/>
       </w:r>
@@ -2316,6 +2495,7 @@
           <w:rFonts w:ascii="David" w:cs="David" w:eastAsia="David" w:hAnsi="David"/>
           <w:i w:val="false"/>
           <w:smallCaps w:val="false"/>
+          <w:noProof/>
           <w:sz w:val="24"/>
           <w:szCs w:val="24"/>
           <w:rtl/>
@@ -2325,6 +2505,7 @@
       <w:r>
         <w:rPr>
           <w:rStyle w:val="FootnoteReference"/>
+          <w:noProof/>
         </w:rPr>
         <w:footnoteReference w:id="48"/>
       </w:r>
@@ -2333,6 +2514,7 @@
           <w:rFonts w:ascii="David" w:cs="David" w:eastAsia="David" w:hAnsi="David"/>
           <w:i w:val="false"/>
           <w:smallCaps w:val="false"/>
+          <w:noProof/>
           <w:sz w:val="24"/>
           <w:szCs w:val="24"/>
           <w:rtl/>
@@ -2342,6 +2524,7 @@
       <w:r>
         <w:rPr>
           <w:rStyle w:val="FootnoteReference"/>
+          <w:noProof/>
         </w:rPr>
         <w:footnoteReference w:id="49"/>
       </w:r>
@@ -2350,6 +2533,7 @@
           <w:rFonts w:ascii="David" w:cs="David" w:eastAsia="David" w:hAnsi="David"/>
           <w:i w:val="false"/>
           <w:smallCaps w:val="false"/>
+          <w:noProof/>
           <w:sz w:val="24"/>
           <w:szCs w:val="24"/>
           <w:rtl/>
@@ -2359,6 +2543,7 @@
       <w:r>
         <w:rPr>
           <w:rStyle w:val="FootnoteReference"/>
+          <w:noProof/>
         </w:rPr>
         <w:footnoteReference w:id="50"/>
       </w:r>
@@ -2367,6 +2552,7 @@
           <w:rFonts w:ascii="David" w:cs="David" w:eastAsia="David" w:hAnsi="David"/>
           <w:i w:val="false"/>
           <w:smallCaps w:val="false"/>
+          <w:noProof/>
           <w:sz w:val="24"/>
           <w:szCs w:val="24"/>
           <w:rtl/>
@@ -2376,6 +2562,7 @@
       <w:r>
         <w:rPr>
           <w:rStyle w:val="FootnoteReference"/>
+          <w:noProof/>
         </w:rPr>
         <w:footnoteReference w:id="51"/>
       </w:r>
@@ -2384,6 +2571,7 @@
           <w:rFonts w:ascii="David" w:cs="David" w:eastAsia="David" w:hAnsi="David"/>
           <w:i w:val="false"/>
           <w:smallCaps w:val="false"/>
+          <w:noProof/>
           <w:sz w:val="24"/>
           <w:szCs w:val="24"/>
           <w:rtl/>
@@ -2393,6 +2581,7 @@
       <w:r>
         <w:rPr>
           <w:rStyle w:val="FootnoteReference"/>
+          <w:noProof/>
         </w:rPr>
         <w:footnoteReference w:id="52"/>
       </w:r>
@@ -2409,6 +2598,7 @@
           <w:rFonts w:ascii="David" w:cs="David" w:eastAsia="David" w:hAnsi="David"/>
           <w:i w:val="false"/>
           <w:smallCaps w:val="false"/>
+          <w:noProof/>
           <w:sz w:val="24"/>
           <w:szCs w:val="24"/>
           <w:rtl/>
@@ -2418,6 +2608,7 @@
       <w:r>
         <w:rPr>
           <w:rStyle w:val="FootnoteReference"/>
+          <w:noProof/>
         </w:rPr>
         <w:footnoteReference w:id="53"/>
       </w:r>
@@ -2426,6 +2617,7 @@
           <w:rFonts w:ascii="David" w:cs="David" w:eastAsia="David" w:hAnsi="David"/>
           <w:i w:val="false"/>
           <w:smallCaps w:val="false"/>
+          <w:noProof/>
           <w:sz w:val="24"/>
           <w:szCs w:val="24"/>
           <w:rtl/>
@@ -2445,6 +2637,7 @@
           <w:rFonts w:ascii="David" w:cs="David" w:eastAsia="David" w:hAnsi="David"/>
           <w:i w:val="false"/>
           <w:smallCaps w:val="false"/>
+          <w:noProof/>
           <w:sz w:val="24"/>
           <w:szCs w:val="24"/>
           <w:rtl/>
@@ -2454,6 +2647,7 @@
       <w:r>
         <w:rPr>
           <w:rStyle w:val="FootnoteReference"/>
+          <w:noProof/>
         </w:rPr>
         <w:footnoteReference w:id="54"/>
       </w:r>
@@ -2462,6 +2656,7 @@
           <w:rFonts w:ascii="David" w:cs="David" w:eastAsia="David" w:hAnsi="David"/>
           <w:i w:val="false"/>
           <w:smallCaps w:val="false"/>
+          <w:noProof/>
           <w:sz w:val="24"/>
           <w:szCs w:val="24"/>
           <w:rtl/>
@@ -2484,6 +2679,7 @@
           <w:bCs/>
           <w:i w:val="false"/>
           <w:smallCaps w:val="false"/>
+          <w:noProof/>
           <w:sz w:val="28"/>
           <w:szCs w:val="28"/>
           <w:rtl/>
@@ -2506,6 +2702,7 @@
           <w:bCs/>
           <w:i w:val="false"/>
           <w:smallCaps w:val="false"/>
+          <w:noProof/>
           <w:sz w:val="24"/>
           <w:szCs w:val="24"/>
           <w:rtl/>
@@ -2525,6 +2722,7 @@
           <w:rFonts w:ascii="David" w:cs="David" w:eastAsia="David" w:hAnsi="David"/>
           <w:i w:val="false"/>
           <w:smallCaps w:val="false"/>
+          <w:noProof/>
           <w:sz w:val="24"/>
           <w:szCs w:val="24"/>
           <w:rtl/>
@@ -2534,6 +2732,7 @@
       <w:r>
         <w:rPr>
           <w:rStyle w:val="FootnoteReference"/>
+          <w:noProof/>
         </w:rPr>
         <w:footnoteReference w:id="55"/>
       </w:r>
@@ -2542,6 +2741,7 @@
           <w:rFonts w:ascii="David" w:cs="David" w:eastAsia="David" w:hAnsi="David"/>
           <w:i w:val="false"/>
           <w:smallCaps w:val="false"/>
+          <w:noProof/>
           <w:sz w:val="24"/>
           <w:szCs w:val="24"/>
           <w:rtl/>
@@ -2551,6 +2751,7 @@
       <w:r>
         <w:rPr>
           <w:rStyle w:val="FootnoteReference"/>
+          <w:noProof/>
         </w:rPr>
         <w:footnoteReference w:id="56"/>
       </w:r>
@@ -2559,6 +2760,7 @@
           <w:rFonts w:ascii="David" w:cs="David" w:eastAsia="David" w:hAnsi="David"/>
           <w:i w:val="false"/>
           <w:smallCaps w:val="false"/>
+          <w:noProof/>
           <w:sz w:val="24"/>
           <w:szCs w:val="24"/>
           <w:rtl/>
@@ -2568,6 +2770,7 @@
       <w:r>
         <w:rPr>
           <w:rStyle w:val="FootnoteReference"/>
+          <w:noProof/>
         </w:rPr>
         <w:footnoteReference w:id="57"/>
       </w:r>
@@ -2576,6 +2779,7 @@
           <w:rFonts w:ascii="David" w:cs="David" w:eastAsia="David" w:hAnsi="David"/>
           <w:i w:val="false"/>
           <w:smallCaps w:val="false"/>
+          <w:noProof/>
           <w:sz w:val="24"/>
           <w:szCs w:val="24"/>
           <w:rtl/>
@@ -2585,6 +2789,7 @@
       <w:r>
         <w:rPr>
           <w:rStyle w:val="FootnoteReference"/>
+          <w:noProof/>
         </w:rPr>
         <w:footnoteReference w:id="58"/>
       </w:r>
@@ -2593,6 +2798,7 @@
           <w:rFonts w:ascii="David" w:cs="David" w:eastAsia="David" w:hAnsi="David"/>
           <w:i w:val="false"/>
           <w:smallCaps w:val="false"/>
+          <w:noProof/>
           <w:sz w:val="24"/>
           <w:szCs w:val="24"/>
           <w:rtl/>
@@ -2615,6 +2821,7 @@
           <w:bCs/>
           <w:i w:val="false"/>
           <w:smallCaps w:val="false"/>
+          <w:noProof/>
           <w:sz w:val="24"/>
           <w:szCs w:val="24"/>
           <w:rtl/>
@@ -2634,6 +2841,7 @@
           <w:rFonts w:ascii="David" w:cs="David" w:eastAsia="David" w:hAnsi="David"/>
           <w:i w:val="false"/>
           <w:smallCaps w:val="false"/>
+          <w:noProof/>
           <w:sz w:val="24"/>
           <w:szCs w:val="24"/>
           <w:rtl/>
@@ -2643,6 +2851,7 @@
       <w:r>
         <w:rPr>
           <w:rStyle w:val="FootnoteReference"/>
+          <w:noProof/>
         </w:rPr>
         <w:footnoteReference w:id="59"/>
       </w:r>
@@ -2651,6 +2860,7 @@
           <w:rFonts w:ascii="David" w:cs="David" w:eastAsia="David" w:hAnsi="David"/>
           <w:i w:val="false"/>
           <w:smallCaps w:val="false"/>
+          <w:noProof/>
           <w:sz w:val="24"/>
           <w:szCs w:val="24"/>
           <w:rtl/>
@@ -2660,6 +2870,7 @@
       <w:r>
         <w:rPr>
           <w:rStyle w:val="FootnoteReference"/>
+          <w:noProof/>
         </w:rPr>
         <w:footnoteReference w:id="60"/>
       </w:r>
@@ -2676,6 +2887,7 @@
           <w:rFonts w:ascii="David" w:cs="David" w:eastAsia="David" w:hAnsi="David"/>
           <w:i w:val="false"/>
           <w:smallCaps w:val="false"/>
+          <w:noProof/>
           <w:sz w:val="24"/>
           <w:szCs w:val="24"/>
           <w:rtl/>
@@ -2685,6 +2897,7 @@
       <w:r>
         <w:rPr>
           <w:rStyle w:val="FootnoteReference"/>
+          <w:noProof/>
         </w:rPr>
         <w:footnoteReference w:id="61"/>
       </w:r>
@@ -2693,6 +2906,7 @@
           <w:rFonts w:ascii="David" w:cs="David" w:eastAsia="David" w:hAnsi="David"/>
           <w:i w:val="false"/>
           <w:smallCaps w:val="false"/>
+          <w:noProof/>
           <w:sz w:val="24"/>
           <w:szCs w:val="24"/>
           <w:rtl/>
@@ -2715,6 +2929,7 @@
           <w:bCs/>
           <w:i w:val="false"/>
           <w:smallCaps w:val="false"/>
+          <w:noProof/>
           <w:sz w:val="24"/>
           <w:szCs w:val="24"/>
           <w:rtl/>
@@ -2734,6 +2949,7 @@
           <w:rFonts w:ascii="David" w:cs="David" w:eastAsia="David" w:hAnsi="David"/>
           <w:i w:val="false"/>
           <w:smallCaps w:val="false"/>
+          <w:noProof/>
           <w:sz w:val="24"/>
           <w:szCs w:val="24"/>
           <w:rtl/>
@@ -2743,6 +2959,7 @@
       <w:r>
         <w:rPr>
           <w:rStyle w:val="FootnoteReference"/>
+          <w:noProof/>
         </w:rPr>
         <w:footnoteReference w:id="62"/>
       </w:r>
@@ -2751,6 +2968,7 @@
           <w:rFonts w:ascii="David" w:cs="David" w:eastAsia="David" w:hAnsi="David"/>
           <w:i w:val="false"/>
           <w:smallCaps w:val="false"/>
+          <w:noProof/>
           <w:sz w:val="24"/>
           <w:szCs w:val="24"/>
           <w:rtl/>
@@ -2760,6 +2978,7 @@
       <w:r>
         <w:rPr>
           <w:rStyle w:val="FootnoteReference"/>
+          <w:noProof/>
         </w:rPr>
         <w:footnoteReference w:id="63"/>
       </w:r>
@@ -2768,6 +2987,7 @@
           <w:rFonts w:ascii="David" w:cs="David" w:eastAsia="David" w:hAnsi="David"/>
           <w:i w:val="false"/>
           <w:smallCaps w:val="false"/>
+          <w:noProof/>
           <w:sz w:val="24"/>
           <w:szCs w:val="24"/>
           <w:rtl/>
@@ -2790,6 +3010,7 @@
           <w:bCs/>
           <w:i w:val="false"/>
           <w:smallCaps w:val="false"/>
+          <w:noProof/>
           <w:sz w:val="24"/>
           <w:szCs w:val="24"/>
           <w:rtl/>
@@ -2809,6 +3030,7 @@
           <w:rFonts w:ascii="David" w:cs="David" w:eastAsia="David" w:hAnsi="David"/>
           <w:i w:val="false"/>
           <w:smallCaps w:val="false"/>
+          <w:noProof/>
           <w:sz w:val="24"/>
           <w:szCs w:val="24"/>
           <w:rtl/>
@@ -2818,6 +3040,7 @@
       <w:r>
         <w:rPr>
           <w:rStyle w:val="FootnoteReference"/>
+          <w:noProof/>
         </w:rPr>
         <w:footnoteReference w:id="64"/>
       </w:r>
@@ -2826,6 +3049,7 @@
           <w:rFonts w:ascii="David" w:cs="David" w:eastAsia="David" w:hAnsi="David"/>
           <w:i w:val="false"/>
           <w:smallCaps w:val="false"/>
+          <w:noProof/>
           <w:sz w:val="24"/>
           <w:szCs w:val="24"/>
           <w:rtl/>
@@ -2835,6 +3059,7 @@
       <w:r>
         <w:rPr>
           <w:rStyle w:val="FootnoteReference"/>
+          <w:noProof/>
         </w:rPr>
         <w:footnoteReference w:id="65"/>
       </w:r>
@@ -2843,6 +3068,7 @@
           <w:rFonts w:ascii="David" w:cs="David" w:eastAsia="David" w:hAnsi="David"/>
           <w:i w:val="false"/>
           <w:smallCaps w:val="false"/>
+          <w:noProof/>
           <w:sz w:val="24"/>
           <w:szCs w:val="24"/>
           <w:rtl/>
@@ -2852,6 +3078,7 @@
       <w:r>
         <w:rPr>
           <w:rStyle w:val="FootnoteReference"/>
+          <w:noProof/>
         </w:rPr>
         <w:footnoteReference w:id="66"/>
       </w:r>
@@ -2860,6 +3087,7 @@
           <w:rFonts w:ascii="David" w:cs="David" w:eastAsia="David" w:hAnsi="David"/>
           <w:i w:val="false"/>
           <w:smallCaps w:val="false"/>
+          <w:noProof/>
           <w:sz w:val="24"/>
           <w:szCs w:val="24"/>
           <w:rtl/>
@@ -2882,6 +3110,7 @@
           <w:bCs/>
           <w:i w:val="false"/>
           <w:smallCaps w:val="false"/>
+          <w:noProof/>
           <w:sz w:val="28"/>
           <w:szCs w:val="28"/>
           <w:rtl/>
@@ -2901,6 +3130,7 @@
           <w:rFonts w:ascii="David" w:cs="David" w:eastAsia="David" w:hAnsi="David"/>
           <w:i w:val="false"/>
           <w:smallCaps w:val="false"/>
+          <w:noProof/>
           <w:sz w:val="24"/>
           <w:szCs w:val="24"/>
           <w:rtl/>
@@ -2920,6 +3150,7 @@
           <w:rFonts w:ascii="David" w:cs="David" w:eastAsia="David" w:hAnsi="David"/>
           <w:i w:val="false"/>
           <w:smallCaps w:val="false"/>
+          <w:noProof/>
           <w:sz w:val="24"/>
           <w:szCs w:val="24"/>
           <w:rtl/>
@@ -2939,6 +3170,7 @@
           <w:rFonts w:ascii="David" w:cs="David" w:eastAsia="David" w:hAnsi="David"/>
           <w:i w:val="false"/>
           <w:smallCaps w:val="false"/>
+          <w:noProof/>
           <w:sz w:val="24"/>
           <w:szCs w:val="24"/>
           <w:rtl/>
@@ -2972,6 +3204,7 @@
           <w:bCs/>
           <w:i w:val="false"/>
           <w:smallCaps w:val="false"/>
+          <w:noProof/>
           <w:sz w:val="28"/>
           <w:szCs w:val="28"/>
           <w:rtl/>
@@ -2993,6 +3226,7 @@
           <w:bCs/>
           <w:i w:val="false"/>
           <w:smallCaps w:val="false"/>
+          <w:noProof/>
           <w:sz w:val="24"/>
           <w:szCs w:val="24"/>
           <w:rtl/>
@@ -3012,6 +3246,7 @@
           <w:rFonts w:ascii="David" w:cs="David" w:eastAsia="David" w:hAnsi="David"/>
           <w:i w:val="false"/>
           <w:smallCaps w:val="false"/>
+          <w:noProof/>
           <w:sz w:val="24"/>
           <w:szCs w:val="24"/>
           <w:rtl/>
@@ -3031,6 +3266,7 @@
           <w:rFonts w:ascii="David" w:cs="David" w:eastAsia="David" w:hAnsi="David"/>
           <w:i w:val="false"/>
           <w:smallCaps w:val="false"/>
+          <w:noProof/>
           <w:sz w:val="24"/>
           <w:szCs w:val="24"/>
           <w:rtl/>
@@ -3050,6 +3286,7 @@
           <w:rFonts w:ascii="David" w:cs="David" w:eastAsia="David" w:hAnsi="David"/>
           <w:i w:val="false"/>
           <w:smallCaps w:val="false"/>
+          <w:noProof/>
           <w:sz w:val="24"/>
           <w:szCs w:val="24"/>
           <w:rtl/>
@@ -3069,6 +3306,7 @@
           <w:rFonts w:ascii="David" w:cs="David" w:eastAsia="David" w:hAnsi="David"/>
           <w:i w:val="false"/>
           <w:smallCaps w:val="false"/>
+          <w:noProof/>
           <w:sz w:val="24"/>
           <w:szCs w:val="24"/>
           <w:rtl/>
@@ -3088,6 +3326,7 @@
           <w:rFonts w:ascii="David" w:cs="David" w:eastAsia="David" w:hAnsi="David"/>
           <w:i w:val="false"/>
           <w:smallCaps w:val="false"/>
+          <w:noProof/>
           <w:sz w:val="24"/>
           <w:szCs w:val="24"/>
           <w:rtl/>
@@ -3107,6 +3346,7 @@
           <w:rFonts w:ascii="David" w:cs="David" w:eastAsia="David" w:hAnsi="David"/>
           <w:i w:val="false"/>
           <w:smallCaps w:val="false"/>
+          <w:noProof/>
           <w:sz w:val="24"/>
           <w:szCs w:val="24"/>
           <w:rtl/>
@@ -3128,6 +3368,7 @@
           <w:bCs/>
           <w:i w:val="false"/>
           <w:smallCaps w:val="false"/>
+          <w:noProof/>
           <w:sz w:val="24"/>
           <w:szCs w:val="24"/>
           <w:rtl/>
@@ -3147,6 +3388,7 @@
           <w:rFonts w:ascii="David" w:cs="David" w:eastAsia="David" w:hAnsi="David"/>
           <w:i w:val="false"/>
           <w:smallCaps w:val="false"/>
+          <w:noProof/>
           <w:sz w:val="24"/>
           <w:szCs w:val="24"/>
           <w:rtl/>
@@ -3160,6 +3402,7 @@
           <w:bCs/>
           <w:i w:val="false"/>
           <w:smallCaps w:val="false"/>
+          <w:noProof/>
           <w:sz w:val="24"/>
           <w:szCs w:val="24"/>
           <w:rtl/>
@@ -3171,6 +3414,7 @@
           <w:rFonts w:ascii="David" w:cs="David" w:eastAsia="David" w:hAnsi="David"/>
           <w:i w:val="false"/>
           <w:smallCaps w:val="false"/>
+          <w:noProof/>
           <w:sz w:val="24"/>
           <w:szCs w:val="24"/>
           <w:rtl/>
@@ -3190,6 +3434,7 @@
           <w:rFonts w:ascii="David" w:cs="David" w:eastAsia="David" w:hAnsi="David"/>
           <w:i w:val="false"/>
           <w:smallCaps w:val="false"/>
+          <w:noProof/>
           <w:sz w:val="24"/>
           <w:szCs w:val="24"/>
           <w:rtl/>
@@ -3203,6 +3448,7 @@
           <w:bCs/>
           <w:i w:val="false"/>
           <w:smallCaps w:val="false"/>
+          <w:noProof/>
           <w:sz w:val="24"/>
           <w:szCs w:val="24"/>
           <w:rtl/>
@@ -3214,6 +3460,7 @@
           <w:rFonts w:ascii="David" w:cs="David" w:eastAsia="David" w:hAnsi="David"/>
           <w:i w:val="false"/>
           <w:smallCaps w:val="false"/>
+          <w:noProof/>
           <w:sz w:val="24"/>
           <w:szCs w:val="24"/>
           <w:rtl/>
@@ -3233,6 +3480,7 @@
           <w:rFonts w:ascii="David" w:cs="David" w:eastAsia="David" w:hAnsi="David"/>
           <w:i w:val="false"/>
           <w:smallCaps w:val="false"/>
+          <w:noProof/>
           <w:sz w:val="24"/>
           <w:szCs w:val="24"/>
           <w:rtl/>
@@ -3246,6 +3494,7 @@
           <w:bCs/>
           <w:i w:val="false"/>
           <w:smallCaps w:val="false"/>
+          <w:noProof/>
           <w:sz w:val="24"/>
           <w:szCs w:val="24"/>
           <w:rtl/>
@@ -3257,6 +3506,7 @@
           <w:rFonts w:ascii="David" w:cs="David" w:eastAsia="David" w:hAnsi="David"/>
           <w:i w:val="false"/>
           <w:smallCaps w:val="false"/>
+          <w:noProof/>
           <w:sz w:val="24"/>
           <w:szCs w:val="24"/>
           <w:rtl/>
@@ -3276,6 +3526,7 @@
           <w:rFonts w:ascii="David" w:cs="David" w:eastAsia="David" w:hAnsi="David"/>
           <w:i w:val="false"/>
           <w:smallCaps w:val="false"/>
+          <w:noProof/>
           <w:sz w:val="24"/>
           <w:szCs w:val="24"/>
           <w:rtl/>
@@ -3289,6 +3540,7 @@
           <w:bCs/>
           <w:i w:val="false"/>
           <w:smallCaps w:val="false"/>
+          <w:noProof/>
           <w:sz w:val="24"/>
           <w:szCs w:val="24"/>
           <w:rtl/>
@@ -3300,6 +3552,7 @@
           <w:rFonts w:ascii="David" w:cs="David" w:eastAsia="David" w:hAnsi="David"/>
           <w:i w:val="false"/>
           <w:smallCaps w:val="false"/>
+          <w:noProof/>
           <w:sz w:val="24"/>
           <w:szCs w:val="24"/>
           <w:rtl/>
@@ -3319,6 +3572,7 @@
           <w:rFonts w:ascii="David" w:cs="David" w:eastAsia="David" w:hAnsi="David"/>
           <w:i w:val="false"/>
           <w:smallCaps w:val="false"/>
+          <w:noProof/>
           <w:sz w:val="24"/>
           <w:szCs w:val="24"/>
           <w:rtl/>
@@ -3332,6 +3586,7 @@
           <w:bCs/>
           <w:i w:val="false"/>
           <w:smallCaps w:val="false"/>
+          <w:noProof/>
           <w:sz w:val="24"/>
           <w:szCs w:val="24"/>
           <w:rtl/>
@@ -3343,6 +3598,7 @@
           <w:rFonts w:ascii="David" w:cs="David" w:eastAsia="David" w:hAnsi="David"/>
           <w:i w:val="false"/>
           <w:smallCaps w:val="false"/>
+          <w:noProof/>
           <w:sz w:val="24"/>
           <w:szCs w:val="24"/>
           <w:rtl/>
@@ -3362,6 +3618,7 @@
           <w:rFonts w:ascii="David" w:cs="David" w:eastAsia="David" w:hAnsi="David"/>
           <w:i w:val="false"/>
           <w:smallCaps w:val="false"/>
+          <w:noProof/>
           <w:sz w:val="24"/>
           <w:szCs w:val="24"/>
           <w:rtl/>
@@ -3375,6 +3632,7 @@
           <w:bCs/>
           <w:i w:val="false"/>
           <w:smallCaps w:val="false"/>
+          <w:noProof/>
           <w:sz w:val="24"/>
           <w:szCs w:val="24"/>
           <w:rtl/>
@@ -3386,6 +3644,7 @@
           <w:rFonts w:ascii="David" w:cs="David" w:eastAsia="David" w:hAnsi="David"/>
           <w:i w:val="false"/>
           <w:smallCaps w:val="false"/>
+          <w:noProof/>
           <w:sz w:val="24"/>
           <w:szCs w:val="24"/>
           <w:rtl/>
@@ -3405,6 +3664,7 @@
           <w:rFonts w:ascii="David" w:cs="David" w:eastAsia="David" w:hAnsi="David"/>
           <w:i w:val="false"/>
           <w:smallCaps w:val="false"/>
+          <w:noProof/>
           <w:sz w:val="24"/>
           <w:szCs w:val="24"/>
           <w:rtl/>
@@ -3418,6 +3678,7 @@
           <w:bCs/>
           <w:i w:val="false"/>
           <w:smallCaps w:val="false"/>
+          <w:noProof/>
           <w:sz w:val="24"/>
           <w:szCs w:val="24"/>
           <w:rtl/>
@@ -3429,6 +3690,7 @@
           <w:rFonts w:ascii="David" w:cs="David" w:eastAsia="David" w:hAnsi="David"/>
           <w:i w:val="false"/>
           <w:smallCaps w:val="false"/>
+          <w:noProof/>
           <w:sz w:val="24"/>
           <w:szCs w:val="24"/>
           <w:rtl/>
@@ -3448,6 +3710,7 @@
           <w:rFonts w:ascii="David" w:cs="David" w:eastAsia="David" w:hAnsi="David"/>
           <w:i w:val="false"/>
           <w:smallCaps w:val="false"/>
+          <w:noProof/>
           <w:sz w:val="24"/>
           <w:szCs w:val="24"/>
           <w:rtl/>
@@ -3461,6 +3724,7 @@
           <w:bCs/>
           <w:i w:val="false"/>
           <w:smallCaps w:val="false"/>
+          <w:noProof/>
           <w:sz w:val="24"/>
           <w:szCs w:val="24"/>
           <w:rtl/>
@@ -3472,6 +3736,7 @@
           <w:rFonts w:ascii="David" w:cs="David" w:eastAsia="David" w:hAnsi="David"/>
           <w:i w:val="false"/>
           <w:smallCaps w:val="false"/>
+          <w:noProof/>
           <w:sz w:val="24"/>
           <w:szCs w:val="24"/>
           <w:rtl/>
@@ -3491,6 +3756,7 @@
           <w:rFonts w:ascii="David" w:cs="David" w:eastAsia="David" w:hAnsi="David"/>
           <w:i w:val="false"/>
           <w:smallCaps w:val="false"/>
+          <w:noProof/>
           <w:sz w:val="24"/>
           <w:szCs w:val="24"/>
           <w:rtl/>
@@ -3504,6 +3770,7 @@
           <w:bCs/>
           <w:i w:val="false"/>
           <w:smallCaps w:val="false"/>
+          <w:noProof/>
           <w:sz w:val="24"/>
           <w:szCs w:val="24"/>
           <w:rtl/>
@@ -3515,6 +3782,7 @@
           <w:rFonts w:ascii="David" w:cs="David" w:eastAsia="David" w:hAnsi="David"/>
           <w:i w:val="false"/>
           <w:smallCaps w:val="false"/>
+          <w:noProof/>
           <w:sz w:val="24"/>
           <w:szCs w:val="24"/>
           <w:rtl/>
@@ -3534,6 +3802,7 @@
           <w:rFonts w:ascii="David" w:cs="David" w:eastAsia="David" w:hAnsi="David"/>
           <w:i w:val="false"/>
           <w:smallCaps w:val="false"/>
+          <w:noProof/>
           <w:sz w:val="24"/>
           <w:szCs w:val="24"/>
           <w:rtl/>
@@ -3547,6 +3816,7 @@
           <w:bCs/>
           <w:i w:val="false"/>
           <w:smallCaps w:val="false"/>
+          <w:noProof/>
           <w:sz w:val="24"/>
           <w:szCs w:val="24"/>
           <w:rtl/>
@@ -3558,6 +3828,7 @@
           <w:rFonts w:ascii="David" w:cs="David" w:eastAsia="David" w:hAnsi="David"/>
           <w:i w:val="false"/>
           <w:smallCaps w:val="false"/>
+          <w:noProof/>
           <w:sz w:val="24"/>
           <w:szCs w:val="24"/>
           <w:rtl/>
@@ -3577,6 +3848,7 @@
           <w:rFonts w:ascii="David" w:cs="David" w:eastAsia="David" w:hAnsi="David"/>
           <w:i w:val="false"/>
           <w:smallCaps w:val="false"/>
+          <w:noProof/>
           <w:sz w:val="24"/>
           <w:szCs w:val="24"/>
           <w:rtl/>
@@ -3590,6 +3862,7 @@
           <w:bCs/>
           <w:i w:val="false"/>
           <w:smallCaps w:val="false"/>
+          <w:noProof/>
           <w:sz w:val="24"/>
           <w:szCs w:val="24"/>
           <w:rtl/>
@@ -3601,6 +3874,7 @@
           <w:rFonts w:ascii="David" w:cs="David" w:eastAsia="David" w:hAnsi="David"/>
           <w:i w:val="false"/>
           <w:smallCaps w:val="false"/>
+          <w:noProof/>
           <w:sz w:val="24"/>
           <w:szCs w:val="24"/>
           <w:rtl/>
@@ -3620,6 +3894,7 @@
           <w:rFonts w:ascii="David" w:cs="David" w:eastAsia="David" w:hAnsi="David"/>
           <w:i w:val="false"/>
           <w:smallCaps w:val="false"/>
+          <w:noProof/>
           <w:sz w:val="24"/>
           <w:szCs w:val="24"/>
           <w:rtl/>
@@ -3633,6 +3908,7 @@
           <w:bCs/>
           <w:i w:val="false"/>
           <w:smallCaps w:val="false"/>
+          <w:noProof/>
           <w:sz w:val="24"/>
           <w:szCs w:val="24"/>
           <w:rtl/>
@@ -3644,6 +3920,7 @@
           <w:rFonts w:ascii="David" w:cs="David" w:eastAsia="David" w:hAnsi="David"/>
           <w:i w:val="false"/>
           <w:smallCaps w:val="false"/>
+          <w:noProof/>
           <w:sz w:val="24"/>
           <w:szCs w:val="24"/>
           <w:rtl/>
@@ -3663,6 +3940,7 @@
           <w:rFonts w:ascii="David" w:cs="David" w:eastAsia="David" w:hAnsi="David"/>
           <w:i w:val="false"/>
           <w:smallCaps w:val="false"/>
+          <w:noProof/>
           <w:sz w:val="24"/>
           <w:szCs w:val="24"/>
           <w:rtl/>
@@ -3676,6 +3954,7 @@
           <w:bCs/>
           <w:i w:val="false"/>
           <w:smallCaps w:val="false"/>
+          <w:noProof/>
           <w:sz w:val="24"/>
           <w:szCs w:val="24"/>
           <w:rtl/>
@@ -3687,6 +3966,7 @@
           <w:rFonts w:ascii="David" w:cs="David" w:eastAsia="David" w:hAnsi="David"/>
           <w:i w:val="false"/>
           <w:smallCaps w:val="false"/>
+          <w:noProof/>
           <w:sz w:val="24"/>
           <w:szCs w:val="24"/>
           <w:rtl/>
@@ -3706,6 +3986,7 @@
           <w:rFonts w:ascii="David" w:cs="David" w:eastAsia="David" w:hAnsi="David"/>
           <w:i w:val="false"/>
           <w:smallCaps w:val="false"/>
+          <w:noProof/>
           <w:sz w:val="24"/>
           <w:szCs w:val="24"/>
           <w:rtl/>
@@ -3719,6 +4000,7 @@
           <w:bCs/>
           <w:i w:val="false"/>
           <w:smallCaps w:val="false"/>
+          <w:noProof/>
           <w:sz w:val="24"/>
           <w:szCs w:val="24"/>
           <w:rtl/>
@@ -3730,6 +4012,7 @@
           <w:rFonts w:ascii="David" w:cs="David" w:eastAsia="David" w:hAnsi="David"/>
           <w:i w:val="false"/>
           <w:smallCaps w:val="false"/>
+          <w:noProof/>
           <w:sz w:val="24"/>
           <w:szCs w:val="24"/>
           <w:rtl/>
@@ -3751,6 +4034,7 @@
           <w:bCs/>
           <w:i w:val="false"/>
           <w:smallCaps w:val="false"/>
+          <w:noProof/>
           <w:sz w:val="24"/>
           <w:szCs w:val="24"/>
           <w:rtl/>
@@ -3770,6 +4054,7 @@
           <w:rFonts w:ascii="David" w:cs="David" w:eastAsia="David" w:hAnsi="David"/>
           <w:i w:val="false"/>
           <w:smallCaps w:val="false"/>
+          <w:noProof/>
           <w:sz w:val="24"/>
           <w:szCs w:val="24"/>
           <w:rtl/>
@@ -3783,6 +4068,7 @@
           <w:bCs/>
           <w:i w:val="false"/>
           <w:smallCaps w:val="false"/>
+          <w:noProof/>
           <w:sz w:val="24"/>
           <w:szCs w:val="24"/>
           <w:rtl/>
@@ -3794,6 +4080,7 @@
           <w:rFonts w:ascii="David" w:cs="David" w:eastAsia="David" w:hAnsi="David"/>
           <w:i w:val="false"/>
           <w:smallCaps w:val="false"/>
+          <w:noProof/>
           <w:sz w:val="24"/>
           <w:szCs w:val="24"/>
           <w:rtl/>
@@ -3813,6 +4100,7 @@
           <w:rFonts w:ascii="David" w:cs="David" w:eastAsia="David" w:hAnsi="David"/>
           <w:i w:val="false"/>
           <w:smallCaps w:val="false"/>
+          <w:noProof/>
           <w:sz w:val="24"/>
           <w:szCs w:val="24"/>
           <w:rtl/>
@@ -3826,6 +4114,7 @@
           <w:bCs/>
           <w:i w:val="false"/>
           <w:smallCaps w:val="false"/>
+          <w:noProof/>
           <w:sz w:val="24"/>
           <w:szCs w:val="24"/>
           <w:rtl/>
@@ -3837,6 +4126,7 @@
           <w:rFonts w:ascii="David" w:cs="David" w:eastAsia="David" w:hAnsi="David"/>
           <w:i w:val="false"/>
           <w:smallCaps w:val="false"/>
+          <w:noProof/>
           <w:sz w:val="24"/>
           <w:szCs w:val="24"/>
           <w:rtl/>
@@ -3856,6 +4146,7 @@
           <w:rFonts w:ascii="David" w:cs="David" w:eastAsia="David" w:hAnsi="David"/>
           <w:i w:val="false"/>
           <w:smallCaps w:val="false"/>
+          <w:noProof/>
           <w:sz w:val="24"/>
           <w:szCs w:val="24"/>
           <w:rtl/>
@@ -3869,6 +4160,7 @@
           <w:bCs/>
           <w:i w:val="false"/>
           <w:smallCaps w:val="false"/>
+          <w:noProof/>
           <w:sz w:val="24"/>
           <w:szCs w:val="24"/>
           <w:rtl/>
@@ -3880,6 +4172,7 @@
           <w:rFonts w:ascii="David" w:cs="David" w:eastAsia="David" w:hAnsi="David"/>
           <w:i w:val="false"/>
           <w:smallCaps w:val="false"/>
+          <w:noProof/>
           <w:sz w:val="24"/>
           <w:szCs w:val="24"/>
           <w:rtl/>
@@ -3899,6 +4192,7 @@
           <w:rFonts w:ascii="David" w:cs="David" w:eastAsia="David" w:hAnsi="David"/>
           <w:i w:val="false"/>
           <w:smallCaps w:val="false"/>
+          <w:noProof/>
           <w:sz w:val="24"/>
           <w:szCs w:val="24"/>
           <w:rtl/>
@@ -3912,6 +4206,7 @@
           <w:bCs/>
           <w:i w:val="false"/>
           <w:smallCaps w:val="false"/>
+          <w:noProof/>
           <w:sz w:val="24"/>
           <w:szCs w:val="24"/>
           <w:rtl/>
@@ -3923,6 +4218,7 @@
           <w:rFonts w:ascii="David" w:cs="David" w:eastAsia="David" w:hAnsi="David"/>
           <w:i w:val="false"/>
           <w:smallCaps w:val="false"/>
+          <w:noProof/>
           <w:sz w:val="24"/>
           <w:szCs w:val="24"/>
           <w:rtl/>
@@ -3942,6 +4238,7 @@
           <w:rFonts w:ascii="David" w:cs="David" w:eastAsia="David" w:hAnsi="David"/>
           <w:i w:val="false"/>
           <w:smallCaps w:val="false"/>
+          <w:noProof/>
           <w:sz w:val="24"/>
           <w:szCs w:val="24"/>
           <w:rtl/>
@@ -3955,6 +4252,7 @@
           <w:bCs/>
           <w:i w:val="false"/>
           <w:smallCaps w:val="false"/>
+          <w:noProof/>
           <w:sz w:val="24"/>
           <w:szCs w:val="24"/>
           <w:rtl/>
@@ -3966,6 +4264,7 @@
           <w:rFonts w:ascii="David" w:cs="David" w:eastAsia="David" w:hAnsi="David"/>
           <w:i w:val="false"/>
           <w:smallCaps w:val="false"/>
+          <w:noProof/>
           <w:sz w:val="24"/>
           <w:szCs w:val="24"/>
           <w:rtl/>
@@ -3985,6 +4284,7 @@
           <w:rFonts w:ascii="David" w:cs="David" w:eastAsia="David" w:hAnsi="David"/>
           <w:i w:val="false"/>
           <w:smallCaps w:val="false"/>
+          <w:noProof/>
           <w:sz w:val="24"/>
           <w:szCs w:val="24"/>
           <w:rtl/>
@@ -3998,6 +4298,7 @@
           <w:bCs/>
           <w:i w:val="false"/>
           <w:smallCaps w:val="false"/>
+          <w:noProof/>
           <w:sz w:val="24"/>
           <w:szCs w:val="24"/>
           <w:rtl/>
@@ -4009,6 +4310,7 @@
           <w:rFonts w:ascii="David" w:cs="David" w:eastAsia="David" w:hAnsi="David"/>
           <w:i w:val="false"/>
           <w:smallCaps w:val="false"/>
+          <w:noProof/>
           <w:sz w:val="24"/>
           <w:szCs w:val="24"/>
           <w:rtl/>
@@ -4028,6 +4330,7 @@
           <w:rFonts w:ascii="David" w:cs="David" w:eastAsia="David" w:hAnsi="David"/>
           <w:i w:val="false"/>
           <w:smallCaps w:val="false"/>
+          <w:noProof/>
           <w:sz w:val="24"/>
           <w:szCs w:val="24"/>
           <w:rtl/>
@@ -4041,6 +4344,7 @@
           <w:bCs/>
           <w:i w:val="false"/>
           <w:smallCaps w:val="false"/>
+          <w:noProof/>
           <w:sz w:val="24"/>
           <w:szCs w:val="24"/>
           <w:rtl/>
@@ -4052,6 +4356,7 @@
           <w:rFonts w:ascii="David" w:cs="David" w:eastAsia="David" w:hAnsi="David"/>
           <w:i w:val="false"/>
           <w:smallCaps w:val="false"/>
+          <w:noProof/>
           <w:sz w:val="24"/>
           <w:szCs w:val="24"/>
           <w:rtl/>
@@ -4071,6 +4376,7 @@
           <w:rFonts w:ascii="David" w:cs="David" w:eastAsia="David" w:hAnsi="David"/>
           <w:i w:val="false"/>
           <w:smallCaps w:val="false"/>
+          <w:noProof/>
           <w:sz w:val="24"/>
           <w:szCs w:val="24"/>
           <w:rtl/>
@@ -4084,6 +4390,7 @@
           <w:bCs/>
           <w:i w:val="false"/>
           <w:smallCaps w:val="false"/>
+          <w:noProof/>
           <w:sz w:val="24"/>
           <w:szCs w:val="24"/>
           <w:rtl/>
@@ -4095,6 +4402,7 @@
           <w:rFonts w:ascii="David" w:cs="David" w:eastAsia="David" w:hAnsi="David"/>
           <w:i w:val="false"/>
           <w:smallCaps w:val="false"/>
+          <w:noProof/>
           <w:sz w:val="24"/>
           <w:szCs w:val="24"/>
           <w:rtl/>
@@ -4114,6 +4422,7 @@
           <w:rFonts w:ascii="David" w:cs="David" w:eastAsia="David" w:hAnsi="David"/>
           <w:i w:val="false"/>
           <w:smallCaps w:val="false"/>
+          <w:noProof/>
           <w:sz w:val="24"/>
           <w:szCs w:val="24"/>
           <w:rtl/>
@@ -4127,6 +4436,7 @@
           <w:bCs/>
           <w:i w:val="false"/>
           <w:smallCaps w:val="false"/>
+          <w:noProof/>
           <w:sz w:val="24"/>
           <w:szCs w:val="24"/>
           <w:rtl/>
@@ -4138,6 +4448,7 @@
           <w:rFonts w:ascii="David" w:cs="David" w:eastAsia="David" w:hAnsi="David"/>
           <w:i w:val="false"/>
           <w:smallCaps w:val="false"/>
+          <w:noProof/>
           <w:sz w:val="24"/>
           <w:szCs w:val="24"/>
           <w:rtl/>
@@ -4157,6 +4468,7 @@
           <w:rFonts w:ascii="David" w:cs="David" w:eastAsia="David" w:hAnsi="David"/>
           <w:i w:val="false"/>
           <w:smallCaps w:val="false"/>
+          <w:noProof/>
           <w:sz w:val="24"/>
           <w:szCs w:val="24"/>
           <w:rtl/>
@@ -4170,6 +4482,7 @@
           <w:bCs/>
           <w:i w:val="false"/>
           <w:smallCaps w:val="false"/>
+          <w:noProof/>
           <w:sz w:val="24"/>
           <w:szCs w:val="24"/>
           <w:rtl/>
@@ -4181,6 +4494,7 @@
           <w:rFonts w:ascii="David" w:cs="David" w:eastAsia="David" w:hAnsi="David"/>
           <w:i w:val="false"/>
           <w:smallCaps w:val="false"/>
+          <w:noProof/>
           <w:sz w:val="24"/>
           <w:szCs w:val="24"/>
           <w:rtl/>
@@ -4200,6 +4514,7 @@
           <w:rFonts w:ascii="David" w:cs="David" w:eastAsia="David" w:hAnsi="David"/>
           <w:i w:val="false"/>
           <w:smallCaps w:val="false"/>
+          <w:noProof/>
           <w:sz w:val="24"/>
           <w:szCs w:val="24"/>
           <w:rtl/>
@@ -4213,6 +4528,7 @@
           <w:bCs/>
           <w:i w:val="false"/>
           <w:smallCaps w:val="false"/>
+          <w:noProof/>
           <w:sz w:val="24"/>
           <w:szCs w:val="24"/>
           <w:rtl/>
@@ -4224,6 +4540,7 @@
           <w:rFonts w:ascii="David" w:cs="David" w:eastAsia="David" w:hAnsi="David"/>
           <w:i w:val="false"/>
           <w:smallCaps w:val="false"/>
+          <w:noProof/>
           <w:sz w:val="24"/>
           <w:szCs w:val="24"/>
           <w:rtl/>
@@ -4245,6 +4562,7 @@
           <w:bCs/>
           <w:i w:val="false"/>
           <w:smallCaps w:val="false"/>
+          <w:noProof/>
           <w:sz w:val="24"/>
           <w:szCs w:val="24"/>
           <w:rtl/>
@@ -4264,6 +4582,7 @@
           <w:rFonts w:ascii="David" w:cs="David" w:eastAsia="David" w:hAnsi="David"/>
           <w:i w:val="false"/>
           <w:smallCaps/>
+          <w:noProof/>
           <w:sz w:val="24"/>
           <w:szCs w:val="24"/>
           <w:rtl w:val="false"/>
@@ -4275,6 +4594,7 @@
           <w:rFonts w:ascii="David" w:cs="David" w:eastAsia="David" w:hAnsi="David"/>
           <w:i w:val="false"/>
           <w:smallCaps w:val="false"/>
+          <w:noProof/>
           <w:sz w:val="24"/>
           <w:szCs w:val="24"/>
           <w:rtl/>
@@ -4295,6 +4615,7 @@
           <w:i/>
           <w:iCs/>
           <w:smallCaps w:val="false"/>
+          <w:noProof/>
           <w:sz w:val="24"/>
           <w:szCs w:val="24"/>
           <w:rtl w:val="false"/>
@@ -4306,6 +4627,7 @@
           <w:rFonts w:ascii="David" w:cs="David" w:eastAsia="David" w:hAnsi="David"/>
           <w:i w:val="false"/>
           <w:smallCaps w:val="false"/>
+          <w:noProof/>
           <w:sz w:val="24"/>
           <w:szCs w:val="24"/>
           <w:rtl w:val="false"/>
@@ -4326,6 +4648,7 @@
           <w:i/>
           <w:iCs/>
           <w:smallCaps w:val="false"/>
+          <w:noProof/>
           <w:sz w:val="24"/>
           <w:szCs w:val="24"/>
           <w:rtl w:val="false"/>
@@ -4337,6 +4660,7 @@
           <w:rFonts w:ascii="David" w:cs="David" w:eastAsia="David" w:hAnsi="David"/>
           <w:i w:val="false"/>
           <w:smallCaps w:val="false"/>
+          <w:noProof/>
           <w:sz w:val="24"/>
           <w:szCs w:val="24"/>
           <w:rtl w:val="false"/>
@@ -4357,6 +4681,7 @@
           <w:i/>
           <w:iCs/>
           <w:smallCaps w:val="false"/>
+          <w:noProof/>
           <w:sz w:val="24"/>
           <w:szCs w:val="24"/>
           <w:rtl w:val="false"/>
@@ -4368,6 +4693,7 @@
           <w:rFonts w:ascii="David" w:cs="David" w:eastAsia="David" w:hAnsi="David"/>
           <w:i w:val="false"/>
           <w:smallCaps w:val="false"/>
+          <w:noProof/>
           <w:sz w:val="24"/>
           <w:szCs w:val="24"/>
           <w:rtl w:val="false"/>
@@ -4388,6 +4714,7 @@
           <w:i/>
           <w:iCs/>
           <w:smallCaps w:val="false"/>
+          <w:noProof/>
           <w:sz w:val="24"/>
           <w:szCs w:val="24"/>
           <w:rtl w:val="false"/>
@@ -4399,6 +4726,7 @@
           <w:rFonts w:ascii="David" w:cs="David" w:eastAsia="David" w:hAnsi="David"/>
           <w:i w:val="false"/>
           <w:smallCaps w:val="false"/>
+          <w:noProof/>
           <w:sz w:val="24"/>
           <w:szCs w:val="24"/>
           <w:rtl w:val="false"/>
@@ -4468,6 +4796,7 @@
     <w:r>
       <w:rPr>
         <w:rFonts w:ascii="David" w:cs="David" w:eastAsia="David" w:hAnsi="David"/>
+        <w:noProof/>
         <w:sz w:val="22"/>
         <w:szCs w:val="22"/>
       </w:rPr>
@@ -4489,6 +4818,7 @@
     <w:r>
       <w:rPr>
         <w:rFonts w:ascii="David" w:cs="David" w:eastAsia="David" w:hAnsi="David"/>
+        <w:noProof/>
         <w:sz w:val="22"/>
         <w:szCs w:val="22"/>
       </w:rPr>
@@ -4511,6 +4841,7 @@
       <w:r>
         <w:rPr>
           <w:rStyle w:val="FootnoteReference"/>
+          <w:noProof/>
         </w:rPr>
         <w:footnoteRef/>
       </w:r>
@@ -4527,6 +4858,7 @@
       <w:r>
         <w:rPr>
           <w:rStyle w:val="FootnoteReference"/>
+          <w:noProof/>
         </w:rPr>
         <w:footnoteRef/>
       </w:r>
@@ -4545,6 +4877,7 @@
       <w:r>
         <w:rPr>
           <w:rStyle w:val="FootnoteReference"/>
+          <w:noProof/>
         </w:rPr>
         <w:footnoteRef/>
       </w:r>
@@ -4553,6 +4886,7 @@
           <w:rFonts w:ascii="David" w:cs="David" w:eastAsia="David" w:hAnsi="David"/>
           <w:i w:val="false"/>
           <w:smallCaps w:val="false"/>
+          <w:noProof/>
           <w:sz w:val="20"/>
           <w:szCs w:val="20"/>
           <w:rtl/>
@@ -4571,6 +4905,7 @@
       <w:r>
         <w:rPr>
           <w:rStyle w:val="FootnoteReference"/>
+          <w:noProof/>
         </w:rPr>
         <w:footnoteRef/>
       </w:r>
@@ -4579,6 +4914,7 @@
           <w:rFonts w:ascii="David" w:cs="David" w:eastAsia="David" w:hAnsi="David"/>
           <w:i w:val="false"/>
           <w:smallCaps w:val="false"/>
+          <w:noProof/>
           <w:sz w:val="20"/>
           <w:szCs w:val="20"/>
           <w:rtl/>
@@ -4597,6 +4933,7 @@
       <w:r>
         <w:rPr>
           <w:rStyle w:val="FootnoteReference"/>
+          <w:noProof/>
         </w:rPr>
         <w:footnoteRef/>
       </w:r>
@@ -4605,6 +4942,7 @@
           <w:rFonts w:ascii="David" w:cs="David" w:eastAsia="David" w:hAnsi="David"/>
           <w:i w:val="false"/>
           <w:smallCaps w:val="false"/>
+          <w:noProof/>
           <w:sz w:val="20"/>
           <w:szCs w:val="20"/>
           <w:rtl/>
@@ -4618,6 +4956,7 @@
           <w:bCs/>
           <w:i w:val="false"/>
           <w:smallCaps w:val="false"/>
+          <w:noProof/>
           <w:sz w:val="20"/>
           <w:szCs w:val="20"/>
           <w:rtl/>
@@ -4629,6 +4968,7 @@
           <w:rFonts w:ascii="David" w:cs="David" w:eastAsia="David" w:hAnsi="David"/>
           <w:i w:val="false"/>
           <w:smallCaps w:val="false"/>
+          <w:noProof/>
           <w:sz w:val="20"/>
           <w:szCs w:val="20"/>
           <w:rtl/>
@@ -4647,6 +4987,7 @@
       <w:r>
         <w:rPr>
           <w:rStyle w:val="FootnoteReference"/>
+          <w:noProof/>
         </w:rPr>
         <w:footnoteRef/>
       </w:r>
@@ -4655,6 +4996,7 @@
           <w:rFonts w:ascii="David" w:cs="David" w:eastAsia="David" w:hAnsi="David"/>
           <w:i w:val="false"/>
           <w:smallCaps w:val="false"/>
+          <w:noProof/>
           <w:sz w:val="20"/>
           <w:szCs w:val="20"/>
           <w:rtl/>
@@ -4673,6 +5015,7 @@
       <w:r>
         <w:rPr>
           <w:rStyle w:val="FootnoteReference"/>
+          <w:noProof/>
         </w:rPr>
         <w:footnoteRef/>
       </w:r>
@@ -4681,6 +5024,7 @@
           <w:rFonts w:ascii="David" w:cs="David" w:eastAsia="David" w:hAnsi="David"/>
           <w:i w:val="false"/>
           <w:smallCaps w:val="false"/>
+          <w:noProof/>
           <w:sz w:val="20"/>
           <w:szCs w:val="20"/>
           <w:rtl/>
@@ -4694,6 +5038,7 @@
           <w:bCs/>
           <w:i w:val="false"/>
           <w:smallCaps w:val="false"/>
+          <w:noProof/>
           <w:sz w:val="20"/>
           <w:szCs w:val="20"/>
           <w:rtl/>
@@ -4705,6 +5050,7 @@
           <w:rFonts w:ascii="David" w:cs="David" w:eastAsia="David" w:hAnsi="David"/>
           <w:i w:val="false"/>
           <w:smallCaps w:val="false"/>
+          <w:noProof/>
           <w:sz w:val="20"/>
           <w:szCs w:val="20"/>
           <w:rtl/>
@@ -4723,6 +5069,7 @@
       <w:r>
         <w:rPr>
           <w:rStyle w:val="FootnoteReference"/>
+          <w:noProof/>
         </w:rPr>
         <w:footnoteRef/>
       </w:r>
@@ -4731,6 +5078,7 @@
           <w:rFonts w:ascii="David" w:cs="David" w:eastAsia="David" w:hAnsi="David"/>
           <w:i w:val="false"/>
           <w:smallCaps w:val="false"/>
+          <w:noProof/>
           <w:sz w:val="20"/>
           <w:szCs w:val="20"/>
           <w:rtl/>
@@ -4744,6 +5092,7 @@
           <w:bCs/>
           <w:i w:val="false"/>
           <w:smallCaps w:val="false"/>
+          <w:noProof/>
           <w:sz w:val="20"/>
           <w:szCs w:val="20"/>
           <w:rtl/>
@@ -4755,6 +5104,7 @@
           <w:rFonts w:ascii="David" w:cs="David" w:eastAsia="David" w:hAnsi="David"/>
           <w:i w:val="false"/>
           <w:smallCaps w:val="false"/>
+          <w:noProof/>
           <w:sz w:val="20"/>
           <w:szCs w:val="20"/>
           <w:rtl/>
@@ -4768,6 +5118,7 @@
           <w:bCs/>
           <w:i w:val="false"/>
           <w:smallCaps w:val="false"/>
+          <w:noProof/>
           <w:sz w:val="20"/>
           <w:szCs w:val="20"/>
           <w:rtl/>
@@ -4779,6 +5130,7 @@
           <w:rFonts w:ascii="David" w:cs="David" w:eastAsia="David" w:hAnsi="David"/>
           <w:i w:val="false"/>
           <w:smallCaps w:val="false"/>
+          <w:noProof/>
           <w:sz w:val="20"/>
           <w:szCs w:val="20"/>
           <w:rtl/>
@@ -4797,6 +5149,7 @@
       <w:r>
         <w:rPr>
           <w:rStyle w:val="FootnoteReference"/>
+          <w:noProof/>
         </w:rPr>
         <w:footnoteRef/>
       </w:r>
@@ -4805,6 +5158,7 @@
           <w:rFonts w:ascii="David" w:cs="David" w:eastAsia="David" w:hAnsi="David"/>
           <w:i w:val="false"/>
           <w:smallCaps w:val="false"/>
+          <w:noProof/>
           <w:sz w:val="20"/>
           <w:szCs w:val="20"/>
           <w:rtl/>
@@ -4823,6 +5177,7 @@
       <w:r>
         <w:rPr>
           <w:rStyle w:val="FootnoteReference"/>
+          <w:noProof/>
         </w:rPr>
         <w:footnoteRef/>
       </w:r>
@@ -4831,6 +5186,7 @@
           <w:rFonts w:ascii="David" w:cs="David" w:eastAsia="David" w:hAnsi="David"/>
           <w:i w:val="false"/>
           <w:smallCaps w:val="false"/>
+          <w:noProof/>
           <w:sz w:val="20"/>
           <w:szCs w:val="20"/>
           <w:rtl/>
@@ -4844,6 +5200,7 @@
           <w:bCs/>
           <w:i w:val="false"/>
           <w:smallCaps w:val="false"/>
+          <w:noProof/>
           <w:sz w:val="20"/>
           <w:szCs w:val="20"/>
           <w:rtl/>
@@ -4855,6 +5212,7 @@
           <w:rFonts w:ascii="David" w:cs="David" w:eastAsia="David" w:hAnsi="David"/>
           <w:i w:val="false"/>
           <w:smallCaps w:val="false"/>
+          <w:noProof/>
           <w:sz w:val="20"/>
           <w:szCs w:val="20"/>
           <w:rtl/>
@@ -4873,6 +5231,7 @@
       <w:r>
         <w:rPr>
           <w:rStyle w:val="FootnoteReference"/>
+          <w:noProof/>
         </w:rPr>
         <w:footnoteRef/>
       </w:r>
@@ -4881,6 +5240,7 @@
           <w:rFonts w:ascii="David" w:cs="David" w:eastAsia="David" w:hAnsi="David"/>
           <w:i w:val="false"/>
           <w:smallCaps w:val="false"/>
+          <w:noProof/>
           <w:sz w:val="20"/>
           <w:szCs w:val="20"/>
           <w:rtl/>
@@ -4894,6 +5254,7 @@
           <w:bCs/>
           <w:i w:val="false"/>
           <w:smallCaps w:val="false"/>
+          <w:noProof/>
           <w:sz w:val="20"/>
           <w:szCs w:val="20"/>
           <w:rtl/>
@@ -4905,6 +5266,7 @@
           <w:rFonts w:ascii="David" w:cs="David" w:eastAsia="David" w:hAnsi="David"/>
           <w:i w:val="false"/>
           <w:smallCaps w:val="false"/>
+          <w:noProof/>
           <w:sz w:val="20"/>
           <w:szCs w:val="20"/>
           <w:rtl/>
@@ -4923,6 +5285,7 @@
       <w:r>
         <w:rPr>
           <w:rStyle w:val="FootnoteReference"/>
+          <w:noProof/>
         </w:rPr>
         <w:footnoteRef/>
       </w:r>
@@ -4931,6 +5294,7 @@
           <w:rFonts w:ascii="David" w:cs="David" w:eastAsia="David" w:hAnsi="David"/>
           <w:i w:val="false"/>
           <w:smallCaps w:val="false"/>
+          <w:noProof/>
           <w:sz w:val="20"/>
           <w:szCs w:val="20"/>
           <w:rtl/>
@@ -4949,6 +5313,7 @@
       <w:r>
         <w:rPr>
           <w:rStyle w:val="FootnoteReference"/>
+          <w:noProof/>
         </w:rPr>
         <w:footnoteRef/>
       </w:r>
@@ -4957,6 +5322,7 @@
           <w:rFonts w:ascii="David" w:cs="David" w:eastAsia="David" w:hAnsi="David"/>
           <w:i w:val="false"/>
           <w:smallCaps w:val="false"/>
+          <w:noProof/>
           <w:sz w:val="20"/>
           <w:szCs w:val="20"/>
           <w:rtl/>
@@ -4970,6 +5336,7 @@
           <w:bCs/>
           <w:i w:val="false"/>
           <w:smallCaps w:val="false"/>
+          <w:noProof/>
           <w:sz w:val="20"/>
           <w:szCs w:val="20"/>
           <w:rtl/>
@@ -4981,6 +5348,7 @@
           <w:rFonts w:ascii="David" w:cs="David" w:eastAsia="David" w:hAnsi="David"/>
           <w:i w:val="false"/>
           <w:smallCaps w:val="false"/>
+          <w:noProof/>
           <w:sz w:val="20"/>
           <w:szCs w:val="20"/>
           <w:rtl/>
@@ -4999,6 +5367,7 @@
       <w:r>
         <w:rPr>
           <w:rStyle w:val="FootnoteReference"/>
+          <w:noProof/>
         </w:rPr>
         <w:footnoteRef/>
       </w:r>
@@ -5007,6 +5376,7 @@
           <w:rFonts w:ascii="David" w:cs="David" w:eastAsia="David" w:hAnsi="David"/>
           <w:i w:val="false"/>
           <w:smallCaps w:val="false"/>
+          <w:noProof/>
           <w:sz w:val="20"/>
           <w:szCs w:val="20"/>
           <w:rtl/>
@@ -5020,6 +5390,7 @@
           <w:bCs/>
           <w:i w:val="false"/>
           <w:smallCaps w:val="false"/>
+          <w:noProof/>
           <w:sz w:val="20"/>
           <w:szCs w:val="20"/>
           <w:rtl/>
@@ -5031,6 +5402,7 @@
           <w:rFonts w:ascii="David" w:cs="David" w:eastAsia="David" w:hAnsi="David"/>
           <w:i w:val="false"/>
           <w:smallCaps w:val="false"/>
+          <w:noProof/>
           <w:sz w:val="20"/>
           <w:szCs w:val="20"/>
           <w:rtl/>
@@ -5049,6 +5421,7 @@
       <w:r>
         <w:rPr>
           <w:rStyle w:val="FootnoteReference"/>
+          <w:noProof/>
         </w:rPr>
         <w:footnoteRef/>
       </w:r>
@@ -5057,6 +5430,7 @@
           <w:rFonts w:ascii="David" w:cs="David" w:eastAsia="David" w:hAnsi="David"/>
           <w:i w:val="false"/>
           <w:smallCaps w:val="false"/>
+          <w:noProof/>
           <w:sz w:val="20"/>
           <w:szCs w:val="20"/>
           <w:rtl/>
@@ -5070,6 +5444,7 @@
           <w:bCs/>
           <w:i w:val="false"/>
           <w:smallCaps w:val="false"/>
+          <w:noProof/>
           <w:sz w:val="20"/>
           <w:szCs w:val="20"/>
           <w:rtl/>
@@ -5081,6 +5456,7 @@
           <w:rFonts w:ascii="David" w:cs="David" w:eastAsia="David" w:hAnsi="David"/>
           <w:i w:val="false"/>
           <w:smallCaps w:val="false"/>
+          <w:noProof/>
           <w:sz w:val="20"/>
           <w:szCs w:val="20"/>
           <w:rtl/>
@@ -5094,6 +5470,7 @@
           <w:bCs/>
           <w:i w:val="false"/>
           <w:smallCaps w:val="false"/>
+          <w:noProof/>
           <w:sz w:val="20"/>
           <w:szCs w:val="20"/>
           <w:rtl/>
@@ -5105,6 +5482,7 @@
           <w:rFonts w:ascii="David" w:cs="David" w:eastAsia="David" w:hAnsi="David"/>
           <w:i w:val="false"/>
           <w:smallCaps w:val="false"/>
+          <w:noProof/>
           <w:sz w:val="20"/>
           <w:szCs w:val="20"/>
           <w:rtl/>
@@ -5123,6 +5501,7 @@
       <w:r>
         <w:rPr>
           <w:rStyle w:val="FootnoteReference"/>
+          <w:noProof/>
         </w:rPr>
         <w:footnoteRef/>
       </w:r>
@@ -5131,6 +5510,7 @@
           <w:rFonts w:ascii="David" w:cs="David" w:eastAsia="David" w:hAnsi="David"/>
           <w:i w:val="false"/>
           <w:smallCaps w:val="false"/>
+          <w:noProof/>
           <w:sz w:val="20"/>
           <w:szCs w:val="20"/>
           <w:rtl/>
@@ -5144,6 +5524,7 @@
           <w:bCs/>
           <w:i w:val="false"/>
           <w:smallCaps w:val="false"/>
+          <w:noProof/>
           <w:sz w:val="20"/>
           <w:szCs w:val="20"/>
           <w:rtl/>
@@ -5155,6 +5536,7 @@
           <w:rFonts w:ascii="David" w:cs="David" w:eastAsia="David" w:hAnsi="David"/>
           <w:i w:val="false"/>
           <w:smallCaps w:val="false"/>
+          <w:noProof/>
           <w:sz w:val="20"/>
           <w:szCs w:val="20"/>
           <w:rtl/>
@@ -5173,6 +5555,7 @@
       <w:r>
         <w:rPr>
           <w:rStyle w:val="FootnoteReference"/>
+          <w:noProof/>
         </w:rPr>
         <w:footnoteRef/>
       </w:r>
@@ -5181,6 +5564,7 @@
           <w:rFonts w:ascii="David" w:cs="David" w:eastAsia="David" w:hAnsi="David"/>
           <w:i w:val="false"/>
           <w:smallCaps w:val="false"/>
+          <w:noProof/>
           <w:sz w:val="20"/>
           <w:szCs w:val="20"/>
           <w:rtl/>
@@ -5194,6 +5578,7 @@
           <w:bCs/>
           <w:i w:val="false"/>
           <w:smallCaps w:val="false"/>
+          <w:noProof/>
           <w:sz w:val="20"/>
           <w:szCs w:val="20"/>
           <w:rtl/>
@@ -5205,6 +5590,7 @@
           <w:rFonts w:ascii="David" w:cs="David" w:eastAsia="David" w:hAnsi="David"/>
           <w:i w:val="false"/>
           <w:smallCaps w:val="false"/>
+          <w:noProof/>
           <w:sz w:val="20"/>
           <w:szCs w:val="20"/>
           <w:rtl/>
@@ -5223,6 +5609,7 @@
       <w:r>
         <w:rPr>
           <w:rStyle w:val="FootnoteReference"/>
+          <w:noProof/>
         </w:rPr>
         <w:footnoteRef/>
       </w:r>
@@ -5231,6 +5618,7 @@
           <w:rFonts w:ascii="David" w:cs="David" w:eastAsia="David" w:hAnsi="David"/>
           <w:i w:val="false"/>
           <w:smallCaps w:val="false"/>
+          <w:noProof/>
           <w:sz w:val="20"/>
           <w:szCs w:val="20"/>
           <w:rtl/>
@@ -5244,6 +5632,7 @@
           <w:bCs/>
           <w:i w:val="false"/>
           <w:smallCaps w:val="false"/>
+          <w:noProof/>
           <w:sz w:val="20"/>
           <w:szCs w:val="20"/>
           <w:rtl/>
@@ -5255,6 +5644,7 @@
           <w:rFonts w:ascii="David" w:cs="David" w:eastAsia="David" w:hAnsi="David"/>
           <w:i w:val="false"/>
           <w:smallCaps w:val="false"/>
+          <w:noProof/>
           <w:sz w:val="20"/>
           <w:szCs w:val="20"/>
           <w:rtl/>
@@ -5273,6 +5663,7 @@
       <w:r>
         <w:rPr>
           <w:rStyle w:val="FootnoteReference"/>
+          <w:noProof/>
         </w:rPr>
         <w:footnoteRef/>
       </w:r>
@@ -5281,6 +5672,7 @@
           <w:rFonts w:ascii="David" w:cs="David" w:eastAsia="David" w:hAnsi="David"/>
           <w:i w:val="false"/>
           <w:smallCaps w:val="false"/>
+          <w:noProof/>
           <w:sz w:val="20"/>
           <w:szCs w:val="20"/>
           <w:rtl/>
@@ -5299,6 +5691,7 @@
       <w:r>
         <w:rPr>
           <w:rStyle w:val="FootnoteReference"/>
+          <w:noProof/>
         </w:rPr>
         <w:footnoteRef/>
       </w:r>
@@ -5307,6 +5700,7 @@
           <w:rFonts w:ascii="David" w:cs="David" w:eastAsia="David" w:hAnsi="David"/>
           <w:i w:val="false"/>
           <w:smallCaps w:val="false"/>
+          <w:noProof/>
           <w:sz w:val="20"/>
           <w:szCs w:val="20"/>
           <w:rtl/>
@@ -5325,6 +5719,7 @@
       <w:r>
         <w:rPr>
           <w:rStyle w:val="FootnoteReference"/>
+          <w:noProof/>
         </w:rPr>
         <w:footnoteRef/>
       </w:r>
@@ -5333,6 +5728,7 @@
           <w:rFonts w:ascii="David" w:cs="David" w:eastAsia="David" w:hAnsi="David"/>
           <w:i w:val="false"/>
           <w:smallCaps w:val="false"/>
+          <w:noProof/>
           <w:sz w:val="20"/>
           <w:szCs w:val="20"/>
           <w:rtl/>
@@ -5351,6 +5747,7 @@
       <w:r>
         <w:rPr>
           <w:rStyle w:val="FootnoteReference"/>
+          <w:noProof/>
         </w:rPr>
         <w:footnoteRef/>
       </w:r>
@@ -5359,6 +5756,7 @@
           <w:rFonts w:ascii="David" w:cs="David" w:eastAsia="David" w:hAnsi="David"/>
           <w:i w:val="false"/>
           <w:smallCaps w:val="false"/>
+          <w:noProof/>
           <w:sz w:val="20"/>
           <w:szCs w:val="20"/>
           <w:rtl/>
@@ -5377,6 +5775,7 @@
       <w:r>
         <w:rPr>
           <w:rStyle w:val="FootnoteReference"/>
+          <w:noProof/>
         </w:rPr>
         <w:footnoteRef/>
       </w:r>
@@ -5385,6 +5784,7 @@
           <w:rFonts w:ascii="David" w:cs="David" w:eastAsia="David" w:hAnsi="David"/>
           <w:i w:val="false"/>
           <w:smallCaps w:val="false"/>
+          <w:noProof/>
           <w:sz w:val="20"/>
           <w:szCs w:val="20"/>
           <w:rtl/>
@@ -5403,6 +5803,7 @@
       <w:r>
         <w:rPr>
           <w:rStyle w:val="FootnoteReference"/>
+          <w:noProof/>
         </w:rPr>
         <w:footnoteRef/>
       </w:r>
@@ -5411,6 +5812,7 @@
           <w:rFonts w:ascii="David" w:cs="David" w:eastAsia="David" w:hAnsi="David"/>
           <w:i w:val="false"/>
           <w:smallCaps w:val="false"/>
+          <w:noProof/>
           <w:sz w:val="20"/>
           <w:szCs w:val="20"/>
           <w:rtl/>
@@ -5424,6 +5826,7 @@
           <w:bCs/>
           <w:i w:val="false"/>
           <w:smallCaps w:val="false"/>
+          <w:noProof/>
           <w:sz w:val="20"/>
           <w:szCs w:val="20"/>
           <w:rtl/>
@@ -5435,6 +5838,7 @@
           <w:rFonts w:ascii="David" w:cs="David" w:eastAsia="David" w:hAnsi="David"/>
           <w:i w:val="false"/>
           <w:smallCaps w:val="false"/>
+          <w:noProof/>
           <w:sz w:val="20"/>
           <w:szCs w:val="20"/>
           <w:rtl/>
@@ -5453,6 +5857,7 @@
       <w:r>
         <w:rPr>
           <w:rStyle w:val="FootnoteReference"/>
+          <w:noProof/>
         </w:rPr>
         <w:footnoteRef/>
       </w:r>
@@ -5461,6 +5866,7 @@
           <w:rFonts w:ascii="David" w:cs="David" w:eastAsia="David" w:hAnsi="David"/>
           <w:i w:val="false"/>
           <w:smallCaps w:val="false"/>
+          <w:noProof/>
           <w:sz w:val="20"/>
           <w:szCs w:val="20"/>
           <w:rtl/>
@@ -5474,6 +5880,7 @@
           <w:bCs/>
           <w:i w:val="false"/>
           <w:smallCaps w:val="false"/>
+          <w:noProof/>
           <w:sz w:val="20"/>
           <w:szCs w:val="20"/>
           <w:rtl/>
@@ -5485,6 +5892,7 @@
           <w:rFonts w:ascii="David" w:cs="David" w:eastAsia="David" w:hAnsi="David"/>
           <w:i w:val="false"/>
           <w:smallCaps w:val="false"/>
+          <w:noProof/>
           <w:sz w:val="20"/>
           <w:szCs w:val="20"/>
           <w:rtl/>
@@ -5498,6 +5906,7 @@
           <w:bCs/>
           <w:i w:val="false"/>
           <w:smallCaps w:val="false"/>
+          <w:noProof/>
           <w:sz w:val="20"/>
           <w:szCs w:val="20"/>
           <w:rtl/>
@@ -5509,6 +5918,7 @@
           <w:rFonts w:ascii="David" w:cs="David" w:eastAsia="David" w:hAnsi="David"/>
           <w:i w:val="false"/>
           <w:smallCaps w:val="false"/>
+          <w:noProof/>
           <w:sz w:val="20"/>
           <w:szCs w:val="20"/>
           <w:rtl/>
@@ -5527,6 +5937,7 @@
       <w:r>
         <w:rPr>
           <w:rStyle w:val="FootnoteReference"/>
+          <w:noProof/>
         </w:rPr>
         <w:footnoteRef/>
       </w:r>
@@ -5535,6 +5946,7 @@
           <w:rFonts w:ascii="David" w:cs="David" w:eastAsia="David" w:hAnsi="David"/>
           <w:i w:val="false"/>
           <w:smallCaps w:val="false"/>
+          <w:noProof/>
           <w:sz w:val="20"/>
           <w:szCs w:val="20"/>
           <w:rtl/>
@@ -5553,6 +5965,7 @@
       <w:r>
         <w:rPr>
           <w:rStyle w:val="FootnoteReference"/>
+          <w:noProof/>
         </w:rPr>
         <w:footnoteRef/>
       </w:r>
@@ -5561,6 +5974,7 @@
           <w:rFonts w:ascii="David" w:cs="David" w:eastAsia="David" w:hAnsi="David"/>
           <w:i w:val="false"/>
           <w:smallCaps w:val="false"/>
+          <w:noProof/>
           <w:sz w:val="20"/>
           <w:szCs w:val="20"/>
           <w:rtl/>
@@ -5579,6 +5993,7 @@
       <w:r>
         <w:rPr>
           <w:rStyle w:val="FootnoteReference"/>
+          <w:noProof/>
         </w:rPr>
         <w:footnoteRef/>
       </w:r>
@@ -5587,6 +6002,7 @@
           <w:rFonts w:ascii="David" w:cs="David" w:eastAsia="David" w:hAnsi="David"/>
           <w:i w:val="false"/>
           <w:smallCaps w:val="false"/>
+          <w:noProof/>
           <w:sz w:val="20"/>
           <w:szCs w:val="20"/>
           <w:rtl/>
@@ -5600,6 +6016,7 @@
           <w:bCs/>
           <w:i w:val="false"/>
           <w:smallCaps w:val="false"/>
+          <w:noProof/>
           <w:sz w:val="20"/>
           <w:szCs w:val="20"/>
           <w:rtl/>
@@ -5611,6 +6028,7 @@
           <w:rFonts w:ascii="David" w:cs="David" w:eastAsia="David" w:hAnsi="David"/>
           <w:i w:val="false"/>
           <w:smallCaps w:val="false"/>
+          <w:noProof/>
           <w:sz w:val="20"/>
           <w:szCs w:val="20"/>
           <w:rtl/>
@@ -5629,6 +6047,7 @@
       <w:r>
         <w:rPr>
           <w:rStyle w:val="FootnoteReference"/>
+          <w:noProof/>
         </w:rPr>
         <w:footnoteRef/>
       </w:r>
@@ -5637,6 +6056,7 @@
           <w:rFonts w:ascii="David" w:cs="David" w:eastAsia="David" w:hAnsi="David"/>
           <w:i w:val="false"/>
           <w:smallCaps w:val="false"/>
+          <w:noProof/>
           <w:sz w:val="20"/>
           <w:szCs w:val="20"/>
           <w:rtl/>
@@ -5655,6 +6075,7 @@
       <w:r>
         <w:rPr>
           <w:rStyle w:val="FootnoteReference"/>
+          <w:noProof/>
         </w:rPr>
         <w:footnoteRef/>
       </w:r>
@@ -5663,6 +6084,7 @@
           <w:rFonts w:ascii="David" w:cs="David" w:eastAsia="David" w:hAnsi="David"/>
           <w:i w:val="false"/>
           <w:smallCaps w:val="false"/>
+          <w:noProof/>
           <w:sz w:val="20"/>
           <w:szCs w:val="20"/>
           <w:rtl/>
@@ -5676,6 +6098,7 @@
           <w:bCs/>
           <w:i w:val="false"/>
           <w:smallCaps w:val="false"/>
+          <w:noProof/>
           <w:sz w:val="20"/>
           <w:szCs w:val="20"/>
           <w:rtl/>
@@ -5687,6 +6110,7 @@
           <w:rFonts w:ascii="David" w:cs="David" w:eastAsia="David" w:hAnsi="David"/>
           <w:i w:val="false"/>
           <w:smallCaps w:val="false"/>
+          <w:noProof/>
           <w:sz w:val="20"/>
           <w:szCs w:val="20"/>
           <w:rtl/>
@@ -5700,6 +6124,7 @@
           <w:bCs/>
           <w:i w:val="false"/>
           <w:smallCaps w:val="false"/>
+          <w:noProof/>
           <w:sz w:val="20"/>
           <w:szCs w:val="20"/>
           <w:rtl/>
@@ -5711,6 +6136,7 @@
           <w:rFonts w:ascii="David" w:cs="David" w:eastAsia="David" w:hAnsi="David"/>
           <w:i w:val="false"/>
           <w:smallCaps w:val="false"/>
+          <w:noProof/>
           <w:sz w:val="20"/>
           <w:szCs w:val="20"/>
           <w:rtl/>
@@ -5729,6 +6155,7 @@
       <w:r>
         <w:rPr>
           <w:rStyle w:val="FootnoteReference"/>
+          <w:noProof/>
         </w:rPr>
         <w:footnoteRef/>
       </w:r>
@@ -5737,6 +6164,7 @@
           <w:rFonts w:ascii="David" w:cs="David" w:eastAsia="David" w:hAnsi="David"/>
           <w:i w:val="false"/>
           <w:smallCaps w:val="false"/>
+          <w:noProof/>
           <w:sz w:val="20"/>
           <w:szCs w:val="20"/>
           <w:rtl/>
@@ -5755,6 +6183,7 @@
       <w:r>
         <w:rPr>
           <w:rStyle w:val="FootnoteReference"/>
+          <w:noProof/>
         </w:rPr>
         <w:footnoteRef/>
       </w:r>
@@ -5763,6 +6192,7 @@
           <w:rFonts w:ascii="David" w:cs="David" w:eastAsia="David" w:hAnsi="David"/>
           <w:i w:val="false"/>
           <w:smallCaps w:val="false"/>
+          <w:noProof/>
           <w:sz w:val="20"/>
           <w:szCs w:val="20"/>
           <w:rtl/>
@@ -5776,6 +6206,7 @@
           <w:bCs/>
           <w:i w:val="false"/>
           <w:smallCaps w:val="false"/>
+          <w:noProof/>
           <w:sz w:val="20"/>
           <w:szCs w:val="20"/>
           <w:rtl/>
@@ -5787,6 +6218,7 @@
           <w:rFonts w:ascii="David" w:cs="David" w:eastAsia="David" w:hAnsi="David"/>
           <w:i w:val="false"/>
           <w:smallCaps w:val="false"/>
+          <w:noProof/>
           <w:sz w:val="20"/>
           <w:szCs w:val="20"/>
           <w:rtl/>
@@ -5805,6 +6237,7 @@
       <w:r>
         <w:rPr>
           <w:rStyle w:val="FootnoteReference"/>
+          <w:noProof/>
         </w:rPr>
         <w:footnoteRef/>
       </w:r>
@@ -5813,6 +6246,7 @@
           <w:rFonts w:ascii="David" w:cs="David" w:eastAsia="David" w:hAnsi="David"/>
           <w:i w:val="false"/>
           <w:smallCaps w:val="false"/>
+          <w:noProof/>
           <w:sz w:val="20"/>
           <w:szCs w:val="20"/>
           <w:rtl/>
@@ -5831,6 +6265,7 @@
       <w:r>
         <w:rPr>
           <w:rStyle w:val="FootnoteReference"/>
+          <w:noProof/>
         </w:rPr>
         <w:footnoteRef/>
       </w:r>
@@ -5839,6 +6274,7 @@
           <w:rFonts w:ascii="David" w:cs="David" w:eastAsia="David" w:hAnsi="David"/>
           <w:i w:val="false"/>
           <w:smallCaps w:val="false"/>
+          <w:noProof/>
           <w:sz w:val="20"/>
           <w:szCs w:val="20"/>
           <w:rtl/>
@@ -5852,6 +6288,7 @@
           <w:bCs/>
           <w:i w:val="false"/>
           <w:smallCaps w:val="false"/>
+          <w:noProof/>
           <w:sz w:val="20"/>
           <w:szCs w:val="20"/>
           <w:rtl/>
@@ -5863,6 +6300,7 @@
           <w:rFonts w:ascii="David" w:cs="David" w:eastAsia="David" w:hAnsi="David"/>
           <w:i w:val="false"/>
           <w:smallCaps w:val="false"/>
+          <w:noProof/>
           <w:sz w:val="20"/>
           <w:szCs w:val="20"/>
           <w:rtl/>
@@ -5881,6 +6319,7 @@
       <w:r>
         <w:rPr>
           <w:rStyle w:val="FootnoteReference"/>
+          <w:noProof/>
         </w:rPr>
         <w:footnoteRef/>
       </w:r>
@@ -5889,6 +6328,7 @@
           <w:rFonts w:ascii="David" w:cs="David" w:eastAsia="David" w:hAnsi="David"/>
           <w:i w:val="false"/>
           <w:smallCaps w:val="false"/>
+          <w:noProof/>
           <w:sz w:val="20"/>
           <w:szCs w:val="20"/>
           <w:rtl/>
@@ -5902,6 +6342,7 @@
           <w:bCs/>
           <w:i w:val="false"/>
           <w:smallCaps w:val="false"/>
+          <w:noProof/>
           <w:sz w:val="20"/>
           <w:szCs w:val="20"/>
           <w:rtl/>
@@ -5913,6 +6354,7 @@
           <w:rFonts w:ascii="David" w:cs="David" w:eastAsia="David" w:hAnsi="David"/>
           <w:i w:val="false"/>
           <w:smallCaps w:val="false"/>
+          <w:noProof/>
           <w:sz w:val="20"/>
           <w:szCs w:val="20"/>
           <w:rtl/>
@@ -5926,6 +6368,7 @@
           <w:bCs/>
           <w:i w:val="false"/>
           <w:smallCaps w:val="false"/>
+          <w:noProof/>
           <w:sz w:val="20"/>
           <w:szCs w:val="20"/>
           <w:rtl/>
@@ -5937,6 +6380,7 @@
           <w:rFonts w:ascii="David" w:cs="David" w:eastAsia="David" w:hAnsi="David"/>
           <w:i w:val="false"/>
           <w:smallCaps w:val="false"/>
+          <w:noProof/>
           <w:sz w:val="20"/>
           <w:szCs w:val="20"/>
           <w:rtl/>
@@ -5950,6 +6394,7 @@
           <w:bCs/>
           <w:i w:val="false"/>
           <w:smallCaps w:val="false"/>
+          <w:noProof/>
           <w:sz w:val="20"/>
           <w:szCs w:val="20"/>
           <w:rtl/>
@@ -5961,6 +6406,7 @@
           <w:rFonts w:ascii="David" w:cs="David" w:eastAsia="David" w:hAnsi="David"/>
           <w:i w:val="false"/>
           <w:smallCaps w:val="false"/>
+          <w:noProof/>
           <w:sz w:val="20"/>
           <w:szCs w:val="20"/>
           <w:rtl/>
@@ -5979,6 +6425,7 @@
       <w:r>
         <w:rPr>
           <w:rStyle w:val="FootnoteReference"/>
+          <w:noProof/>
         </w:rPr>
         <w:footnoteRef/>
       </w:r>
@@ -5987,6 +6434,7 @@
           <w:rFonts w:ascii="David" w:cs="David" w:eastAsia="David" w:hAnsi="David"/>
           <w:i w:val="false"/>
           <w:smallCaps w:val="false"/>
+          <w:noProof/>
           <w:sz w:val="20"/>
           <w:szCs w:val="20"/>
           <w:rtl/>
@@ -6000,6 +6448,7 @@
           <w:bCs/>
           <w:i w:val="false"/>
           <w:smallCaps w:val="false"/>
+          <w:noProof/>
           <w:sz w:val="20"/>
           <w:szCs w:val="20"/>
           <w:rtl/>
@@ -6011,6 +6460,7 @@
           <w:rFonts w:ascii="David" w:cs="David" w:eastAsia="David" w:hAnsi="David"/>
           <w:i w:val="false"/>
           <w:smallCaps w:val="false"/>
+          <w:noProof/>
           <w:sz w:val="20"/>
           <w:szCs w:val="20"/>
           <w:rtl/>
@@ -6029,6 +6479,7 @@
       <w:r>
         <w:rPr>
           <w:rStyle w:val="FootnoteReference"/>
+          <w:noProof/>
         </w:rPr>
         <w:footnoteRef/>
       </w:r>
@@ -6037,6 +6488,7 @@
           <w:rFonts w:ascii="David" w:cs="David" w:eastAsia="David" w:hAnsi="David"/>
           <w:i w:val="false"/>
           <w:smallCaps w:val="false"/>
+          <w:noProof/>
           <w:sz w:val="20"/>
           <w:szCs w:val="20"/>
           <w:rtl/>
@@ -6055,6 +6507,7 @@
       <w:r>
         <w:rPr>
           <w:rStyle w:val="FootnoteReference"/>
+          <w:noProof/>
         </w:rPr>
         <w:footnoteRef/>
       </w:r>
@@ -6063,6 +6516,7 @@
           <w:rFonts w:ascii="David" w:cs="David" w:eastAsia="David" w:hAnsi="David"/>
           <w:i w:val="false"/>
           <w:smallCaps w:val="false"/>
+          <w:noProof/>
           <w:sz w:val="20"/>
           <w:szCs w:val="20"/>
           <w:rtl/>
@@ -6076,6 +6530,7 @@
           <w:bCs/>
           <w:i w:val="false"/>
           <w:smallCaps w:val="false"/>
+          <w:noProof/>
           <w:sz w:val="20"/>
           <w:szCs w:val="20"/>
           <w:rtl/>
@@ -6087,6 +6542,7 @@
           <w:rFonts w:ascii="David" w:cs="David" w:eastAsia="David" w:hAnsi="David"/>
           <w:i w:val="false"/>
           <w:smallCaps w:val="false"/>
+          <w:noProof/>
           <w:sz w:val="20"/>
           <w:szCs w:val="20"/>
           <w:rtl/>
@@ -6105,6 +6561,7 @@
       <w:r>
         <w:rPr>
           <w:rStyle w:val="FootnoteReference"/>
+          <w:noProof/>
         </w:rPr>
         <w:footnoteRef/>
       </w:r>
@@ -6113,6 +6570,7 @@
           <w:rFonts w:ascii="David" w:cs="David" w:eastAsia="David" w:hAnsi="David"/>
           <w:i w:val="false"/>
           <w:smallCaps w:val="false"/>
+          <w:noProof/>
           <w:sz w:val="20"/>
           <w:szCs w:val="20"/>
           <w:rtl/>
@@ -6126,6 +6584,7 @@
           <w:bCs/>
           <w:i w:val="false"/>
           <w:smallCaps w:val="false"/>
+          <w:noProof/>
           <w:sz w:val="20"/>
           <w:szCs w:val="20"/>
           <w:rtl/>
@@ -6137,6 +6596,7 @@
           <w:rFonts w:ascii="David" w:cs="David" w:eastAsia="David" w:hAnsi="David"/>
           <w:i w:val="false"/>
           <w:smallCaps w:val="false"/>
+          <w:noProof/>
           <w:sz w:val="20"/>
           <w:szCs w:val="20"/>
           <w:rtl/>
@@ -6155,6 +6615,7 @@
       <w:r>
         <w:rPr>
           <w:rStyle w:val="FootnoteReference"/>
+          <w:noProof/>
         </w:rPr>
         <w:footnoteRef/>
       </w:r>
@@ -6163,6 +6624,7 @@
           <w:rFonts w:ascii="David" w:cs="David" w:eastAsia="David" w:hAnsi="David"/>
           <w:i w:val="false"/>
           <w:smallCaps w:val="false"/>
+          <w:noProof/>
           <w:sz w:val="20"/>
           <w:szCs w:val="20"/>
           <w:rtl/>
@@ -6176,6 +6638,7 @@
           <w:bCs/>
           <w:i w:val="false"/>
           <w:smallCaps w:val="false"/>
+          <w:noProof/>
           <w:sz w:val="20"/>
           <w:szCs w:val="20"/>
           <w:rtl/>
@@ -6187,6 +6650,7 @@
           <w:rFonts w:ascii="David" w:cs="David" w:eastAsia="David" w:hAnsi="David"/>
           <w:i w:val="false"/>
           <w:smallCaps w:val="false"/>
+          <w:noProof/>
           <w:sz w:val="20"/>
           <w:szCs w:val="20"/>
           <w:rtl/>
@@ -6205,6 +6669,7 @@
       <w:r>
         <w:rPr>
           <w:rStyle w:val="FootnoteReference"/>
+          <w:noProof/>
         </w:rPr>
         <w:footnoteRef/>
       </w:r>
@@ -6213,6 +6678,7 @@
           <w:rFonts w:ascii="David" w:cs="David" w:eastAsia="David" w:hAnsi="David"/>
           <w:i w:val="false"/>
           <w:smallCaps w:val="false"/>
+          <w:noProof/>
           <w:sz w:val="20"/>
           <w:szCs w:val="20"/>
           <w:rtl/>
@@ -6226,6 +6692,7 @@
           <w:bCs/>
           <w:i w:val="false"/>
           <w:smallCaps w:val="false"/>
+          <w:noProof/>
           <w:sz w:val="20"/>
           <w:szCs w:val="20"/>
           <w:rtl/>
@@ -6237,6 +6704,7 @@
           <w:rFonts w:ascii="David" w:cs="David" w:eastAsia="David" w:hAnsi="David"/>
           <w:i w:val="false"/>
           <w:smallCaps w:val="false"/>
+          <w:noProof/>
           <w:sz w:val="20"/>
           <w:szCs w:val="20"/>
           <w:rtl/>
@@ -6255,6 +6723,7 @@
       <w:r>
         <w:rPr>
           <w:rStyle w:val="FootnoteReference"/>
+          <w:noProof/>
         </w:rPr>
         <w:footnoteRef/>
       </w:r>
@@ -6263,6 +6732,7 @@
           <w:rFonts w:ascii="David" w:cs="David" w:eastAsia="David" w:hAnsi="David"/>
           <w:i w:val="false"/>
           <w:smallCaps w:val="false"/>
+          <w:noProof/>
           <w:sz w:val="20"/>
           <w:szCs w:val="20"/>
           <w:rtl/>
@@ -6276,6 +6746,7 @@
           <w:bCs/>
           <w:i w:val="false"/>
           <w:smallCaps w:val="false"/>
+          <w:noProof/>
           <w:sz w:val="20"/>
           <w:szCs w:val="20"/>
           <w:rtl/>
@@ -6287,6 +6758,7 @@
           <w:rFonts w:ascii="David" w:cs="David" w:eastAsia="David" w:hAnsi="David"/>
           <w:i w:val="false"/>
           <w:smallCaps w:val="false"/>
+          <w:noProof/>
           <w:sz w:val="20"/>
           <w:szCs w:val="20"/>
           <w:rtl/>
@@ -6305,6 +6777,7 @@
       <w:r>
         <w:rPr>
           <w:rStyle w:val="FootnoteReference"/>
+          <w:noProof/>
         </w:rPr>
         <w:footnoteRef/>
       </w:r>
@@ -6313,6 +6786,7 @@
           <w:rFonts w:ascii="David" w:cs="David" w:eastAsia="David" w:hAnsi="David"/>
           <w:i w:val="false"/>
           <w:smallCaps w:val="false"/>
+          <w:noProof/>
           <w:sz w:val="20"/>
           <w:szCs w:val="20"/>
           <w:rtl/>
@@ -6326,6 +6800,7 @@
           <w:bCs/>
           <w:i w:val="false"/>
           <w:smallCaps w:val="false"/>
+          <w:noProof/>
           <w:sz w:val="20"/>
           <w:szCs w:val="20"/>
           <w:rtl/>
@@ -6337,6 +6812,7 @@
           <w:rFonts w:ascii="David" w:cs="David" w:eastAsia="David" w:hAnsi="David"/>
           <w:i w:val="false"/>
           <w:smallCaps w:val="false"/>
+          <w:noProof/>
           <w:sz w:val="20"/>
           <w:szCs w:val="20"/>
           <w:rtl/>
@@ -6355,6 +6831,7 @@
       <w:r>
         <w:rPr>
           <w:rStyle w:val="FootnoteReference"/>
+          <w:noProof/>
         </w:rPr>
         <w:footnoteRef/>
       </w:r>
@@ -6363,6 +6840,7 @@
           <w:rFonts w:ascii="David" w:cs="David" w:eastAsia="David" w:hAnsi="David"/>
           <w:i w:val="false"/>
           <w:smallCaps w:val="false"/>
+          <w:noProof/>
           <w:sz w:val="20"/>
           <w:szCs w:val="20"/>
           <w:rtl/>
@@ -6376,6 +6854,7 @@
           <w:bCs/>
           <w:i w:val="false"/>
           <w:smallCaps w:val="false"/>
+          <w:noProof/>
           <w:sz w:val="20"/>
           <w:szCs w:val="20"/>
           <w:rtl/>
@@ -6387,6 +6866,7 @@
           <w:rFonts w:ascii="David" w:cs="David" w:eastAsia="David" w:hAnsi="David"/>
           <w:i w:val="false"/>
           <w:smallCaps w:val="false"/>
+          <w:noProof/>
           <w:sz w:val="20"/>
           <w:szCs w:val="20"/>
           <w:rtl/>
@@ -6405,6 +6885,7 @@
       <w:r>
         <w:rPr>
           <w:rStyle w:val="FootnoteReference"/>
+          <w:noProof/>
         </w:rPr>
         <w:footnoteRef/>
       </w:r>
@@ -6413,6 +6894,7 @@
           <w:rFonts w:ascii="David" w:cs="David" w:eastAsia="David" w:hAnsi="David"/>
           <w:i w:val="false"/>
           <w:smallCaps w:val="false"/>
+          <w:noProof/>
           <w:sz w:val="20"/>
           <w:szCs w:val="20"/>
           <w:rtl/>
@@ -6431,6 +6913,7 @@
       <w:r>
         <w:rPr>
           <w:rStyle w:val="FootnoteReference"/>
+          <w:noProof/>
         </w:rPr>
         <w:footnoteRef/>
       </w:r>
@@ -6439,6 +6922,7 @@
           <w:rFonts w:ascii="David" w:cs="David" w:eastAsia="David" w:hAnsi="David"/>
           <w:i w:val="false"/>
           <w:smallCaps w:val="false"/>
+          <w:noProof/>
           <w:sz w:val="20"/>
           <w:szCs w:val="20"/>
           <w:rtl/>
@@ -6452,6 +6936,7 @@
           <w:bCs/>
           <w:i w:val="false"/>
           <w:smallCaps w:val="false"/>
+          <w:noProof/>
           <w:sz w:val="20"/>
           <w:szCs w:val="20"/>
           <w:rtl/>
@@ -6463,6 +6948,7 @@
           <w:rFonts w:ascii="David" w:cs="David" w:eastAsia="David" w:hAnsi="David"/>
           <w:i w:val="false"/>
           <w:smallCaps w:val="false"/>
+          <w:noProof/>
           <w:sz w:val="20"/>
           <w:szCs w:val="20"/>
           <w:rtl/>
@@ -6476,6 +6962,7 @@
           <w:bCs/>
           <w:i w:val="false"/>
           <w:smallCaps w:val="false"/>
+          <w:noProof/>
           <w:sz w:val="20"/>
           <w:szCs w:val="20"/>
           <w:rtl/>
@@ -6487,6 +6974,7 @@
           <w:rFonts w:ascii="David" w:cs="David" w:eastAsia="David" w:hAnsi="David"/>
           <w:i w:val="false"/>
           <w:smallCaps w:val="false"/>
+          <w:noProof/>
           <w:sz w:val="20"/>
           <w:szCs w:val="20"/>
           <w:rtl/>
@@ -6505,6 +6993,7 @@
       <w:r>
         <w:rPr>
           <w:rStyle w:val="FootnoteReference"/>
+          <w:noProof/>
         </w:rPr>
         <w:footnoteRef/>
       </w:r>
@@ -6513,6 +7002,7 @@
           <w:rFonts w:ascii="David" w:cs="David" w:eastAsia="David" w:hAnsi="David"/>
           <w:i w:val="false"/>
           <w:smallCaps w:val="false"/>
+          <w:noProof/>
           <w:sz w:val="20"/>
           <w:szCs w:val="20"/>
           <w:rtl/>
@@ -6531,6 +7021,7 @@
       <w:r>
         <w:rPr>
           <w:rStyle w:val="FootnoteReference"/>
+          <w:noProof/>
         </w:rPr>
         <w:footnoteRef/>
       </w:r>
@@ -6539,6 +7030,7 @@
           <w:rFonts w:ascii="David" w:cs="David" w:eastAsia="David" w:hAnsi="David"/>
           <w:i w:val="false"/>
           <w:smallCaps w:val="false"/>
+          <w:noProof/>
           <w:sz w:val="20"/>
           <w:szCs w:val="20"/>
           <w:rtl/>
@@ -6552,6 +7044,7 @@
           <w:bCs/>
           <w:i w:val="false"/>
           <w:smallCaps w:val="false"/>
+          <w:noProof/>
           <w:sz w:val="20"/>
           <w:szCs w:val="20"/>
           <w:rtl/>
@@ -6563,6 +7056,7 @@
           <w:rFonts w:ascii="David" w:cs="David" w:eastAsia="David" w:hAnsi="David"/>
           <w:i w:val="false"/>
           <w:smallCaps w:val="false"/>
+          <w:noProof/>
           <w:sz w:val="20"/>
           <w:szCs w:val="20"/>
           <w:rtl/>
@@ -6581,6 +7075,7 @@
       <w:r>
         <w:rPr>
           <w:rStyle w:val="FootnoteReference"/>
+          <w:noProof/>
         </w:rPr>
         <w:footnoteRef/>
       </w:r>
@@ -6589,6 +7084,7 @@
           <w:rFonts w:ascii="David" w:cs="David" w:eastAsia="David" w:hAnsi="David"/>
           <w:i w:val="false"/>
           <w:smallCaps w:val="false"/>
+          <w:noProof/>
           <w:sz w:val="20"/>
           <w:szCs w:val="20"/>
           <w:rtl/>
@@ -6607,6 +7103,7 @@
       <w:r>
         <w:rPr>
           <w:rStyle w:val="FootnoteReference"/>
+          <w:noProof/>
         </w:rPr>
         <w:footnoteRef/>
       </w:r>
@@ -6615,6 +7112,7 @@
           <w:rFonts w:ascii="David" w:cs="David" w:eastAsia="David" w:hAnsi="David"/>
           <w:i w:val="false"/>
           <w:smallCaps w:val="false"/>
+          <w:noProof/>
           <w:sz w:val="20"/>
           <w:szCs w:val="20"/>
           <w:rtl/>
@@ -6627,6 +7125,7 @@
           <w:i/>
           <w:iCs/>
           <w:smallCaps w:val="false"/>
+          <w:noProof/>
           <w:sz w:val="20"/>
           <w:szCs w:val="20"/>
           <w:rtl w:val="false"/>
@@ -6638,6 +7137,7 @@
           <w:rFonts w:ascii="David" w:cs="David" w:eastAsia="David" w:hAnsi="David"/>
           <w:i w:val="false"/>
           <w:smallCaps w:val="false"/>
+          <w:noProof/>
           <w:sz w:val="20"/>
           <w:szCs w:val="20"/>
           <w:rtl w:val="false"/>
@@ -6656,6 +7156,7 @@
       <w:r>
         <w:rPr>
           <w:rStyle w:val="FootnoteReference"/>
+          <w:noProof/>
         </w:rPr>
         <w:footnoteRef/>
       </w:r>
@@ -6664,6 +7165,7 @@
           <w:rFonts w:ascii="David" w:cs="David" w:eastAsia="David" w:hAnsi="David"/>
           <w:i w:val="false"/>
           <w:smallCaps w:val="false"/>
+          <w:noProof/>
           <w:sz w:val="20"/>
           <w:szCs w:val="20"/>
           <w:rtl/>
@@ -6677,6 +7179,7 @@
           <w:bCs/>
           <w:i w:val="false"/>
           <w:smallCaps w:val="false"/>
+          <w:noProof/>
           <w:sz w:val="20"/>
           <w:szCs w:val="20"/>
           <w:rtl/>
@@ -6688,6 +7191,7 @@
           <w:rFonts w:ascii="David" w:cs="David" w:eastAsia="David" w:hAnsi="David"/>
           <w:i w:val="false"/>
           <w:smallCaps w:val="false"/>
+          <w:noProof/>
           <w:sz w:val="20"/>
           <w:szCs w:val="20"/>
           <w:rtl/>
@@ -6706,6 +7210,7 @@
       <w:r>
         <w:rPr>
           <w:rStyle w:val="FootnoteReference"/>
+          <w:noProof/>
         </w:rPr>
         <w:footnoteRef/>
       </w:r>
@@ -6714,6 +7219,7 @@
           <w:rFonts w:ascii="David" w:cs="David" w:eastAsia="David" w:hAnsi="David"/>
           <w:i w:val="false"/>
           <w:smallCaps w:val="false"/>
+          <w:noProof/>
           <w:sz w:val="20"/>
           <w:szCs w:val="20"/>
           <w:rtl/>
@@ -6726,6 +7232,7 @@
           <w:i/>
           <w:iCs/>
           <w:smallCaps w:val="false"/>
+          <w:noProof/>
           <w:sz w:val="20"/>
           <w:szCs w:val="20"/>
           <w:rtl w:val="false"/>
@@ -6737,6 +7244,7 @@
           <w:rFonts w:ascii="David" w:cs="David" w:eastAsia="David" w:hAnsi="David"/>
           <w:i w:val="false"/>
           <w:smallCaps w:val="false"/>
+          <w:noProof/>
           <w:sz w:val="20"/>
           <w:szCs w:val="20"/>
           <w:rtl/>
@@ -6755,6 +7263,7 @@
       <w:r>
         <w:rPr>
           <w:rStyle w:val="FootnoteReference"/>
+          <w:noProof/>
         </w:rPr>
         <w:footnoteRef/>
       </w:r>
@@ -6763,6 +7272,7 @@
           <w:rFonts w:ascii="David" w:cs="David" w:eastAsia="David" w:hAnsi="David"/>
           <w:i w:val="false"/>
           <w:smallCaps w:val="false"/>
+          <w:noProof/>
           <w:sz w:val="20"/>
           <w:szCs w:val="20"/>
           <w:rtl/>
@@ -6775,6 +7285,7 @@
           <w:i/>
           <w:iCs/>
           <w:smallCaps w:val="false"/>
+          <w:noProof/>
           <w:sz w:val="20"/>
           <w:szCs w:val="20"/>
           <w:rtl w:val="false"/>
@@ -6786,6 +7297,7 @@
           <w:rFonts w:ascii="David" w:cs="David" w:eastAsia="David" w:hAnsi="David"/>
           <w:i w:val="false"/>
           <w:smallCaps w:val="false"/>
+          <w:noProof/>
           <w:sz w:val="20"/>
           <w:szCs w:val="20"/>
           <w:rtl/>
@@ -6804,6 +7316,7 @@
       <w:r>
         <w:rPr>
           <w:rStyle w:val="FootnoteReference"/>
+          <w:noProof/>
         </w:rPr>
         <w:footnoteRef/>
       </w:r>
@@ -6812,6 +7325,7 @@
           <w:rFonts w:ascii="David" w:cs="David" w:eastAsia="David" w:hAnsi="David"/>
           <w:i w:val="false"/>
           <w:smallCaps w:val="false"/>
+          <w:noProof/>
           <w:sz w:val="20"/>
           <w:szCs w:val="20"/>
           <w:rtl/>
@@ -6824,6 +7338,7 @@
           <w:i/>
           <w:iCs/>
           <w:smallCaps w:val="false"/>
+          <w:noProof/>
           <w:sz w:val="20"/>
           <w:szCs w:val="20"/>
           <w:rtl w:val="false"/>
@@ -6835,6 +7350,7 @@
           <w:rFonts w:ascii="David" w:cs="David" w:eastAsia="David" w:hAnsi="David"/>
           <w:i w:val="false"/>
           <w:smallCaps w:val="false"/>
+          <w:noProof/>
           <w:sz w:val="20"/>
           <w:szCs w:val="20"/>
           <w:rtl w:val="false"/>
@@ -6853,6 +7369,7 @@
       <w:r>
         <w:rPr>
           <w:rStyle w:val="FootnoteReference"/>
+          <w:noProof/>
         </w:rPr>
         <w:footnoteRef/>
       </w:r>
@@ -6861,6 +7378,7 @@
           <w:rFonts w:ascii="David" w:cs="David" w:eastAsia="David" w:hAnsi="David"/>
           <w:i w:val="false"/>
           <w:smallCaps w:val="false"/>
+          <w:noProof/>
           <w:sz w:val="20"/>
           <w:szCs w:val="20"/>
           <w:rtl/>
@@ -6879,6 +7397,7 @@
       <w:r>
         <w:rPr>
           <w:rStyle w:val="FootnoteReference"/>
+          <w:noProof/>
         </w:rPr>
         <w:footnoteRef/>
       </w:r>
@@ -6887,6 +7406,7 @@
           <w:rFonts w:ascii="David" w:cs="David" w:eastAsia="David" w:hAnsi="David"/>
           <w:i w:val="false"/>
           <w:smallCaps w:val="false"/>
+          <w:noProof/>
           <w:sz w:val="20"/>
           <w:szCs w:val="20"/>
           <w:rtl/>
@@ -6898,6 +7418,7 @@
           <w:rFonts w:ascii="David" w:cs="David" w:eastAsia="David" w:hAnsi="David"/>
           <w:i w:val="false"/>
           <w:smallCaps/>
+          <w:noProof/>
           <w:sz w:val="20"/>
           <w:szCs w:val="20"/>
           <w:rtl w:val="false"/>
@@ -6909,6 +7430,7 @@
           <w:rFonts w:ascii="David" w:cs="David" w:eastAsia="David" w:hAnsi="David"/>
           <w:i w:val="false"/>
           <w:smallCaps w:val="false"/>
+          <w:noProof/>
           <w:sz w:val="20"/>
           <w:szCs w:val="20"/>
           <w:rtl/>
@@ -6927,6 +7449,7 @@
       <w:r>
         <w:rPr>
           <w:rStyle w:val="FootnoteReference"/>
+          <w:noProof/>
         </w:rPr>
         <w:footnoteRef/>
       </w:r>
@@ -6935,6 +7458,7 @@
           <w:rFonts w:ascii="David" w:cs="David" w:eastAsia="David" w:hAnsi="David"/>
           <w:i w:val="false"/>
           <w:smallCaps w:val="false"/>
+          <w:noProof/>
           <w:sz w:val="20"/>
           <w:szCs w:val="20"/>
           <w:rtl/>
@@ -6953,6 +7477,7 @@
       <w:r>
         <w:rPr>
           <w:rStyle w:val="FootnoteReference"/>
+          <w:noProof/>
         </w:rPr>
         <w:footnoteRef/>
       </w:r>
@@ -6961,6 +7486,7 @@
           <w:rFonts w:ascii="David" w:cs="David" w:eastAsia="David" w:hAnsi="David"/>
           <w:i w:val="false"/>
           <w:smallCaps w:val="false"/>
+          <w:noProof/>
           <w:sz w:val="20"/>
           <w:szCs w:val="20"/>
           <w:rtl/>
@@ -6974,6 +7500,7 @@
           <w:bCs/>
           <w:i w:val="false"/>
           <w:smallCaps w:val="false"/>
+          <w:noProof/>
           <w:sz w:val="20"/>
           <w:szCs w:val="20"/>
           <w:rtl/>
@@ -6985,6 +7512,7 @@
           <w:rFonts w:ascii="David" w:cs="David" w:eastAsia="David" w:hAnsi="David"/>
           <w:i w:val="false"/>
           <w:smallCaps w:val="false"/>
+          <w:noProof/>
           <w:sz w:val="20"/>
           <w:szCs w:val="20"/>
           <w:rtl/>
@@ -6998,6 +7526,7 @@
           <w:bCs/>
           <w:i w:val="false"/>
           <w:smallCaps w:val="false"/>
+          <w:noProof/>
           <w:sz w:val="20"/>
           <w:szCs w:val="20"/>
           <w:rtl/>
@@ -7009,6 +7538,7 @@
           <w:rFonts w:ascii="David" w:cs="David" w:eastAsia="David" w:hAnsi="David"/>
           <w:i w:val="false"/>
           <w:smallCaps w:val="false"/>
+          <w:noProof/>
           <w:sz w:val="20"/>
           <w:szCs w:val="20"/>
           <w:rtl/>
@@ -7027,6 +7557,7 @@
       <w:r>
         <w:rPr>
           <w:rStyle w:val="FootnoteReference"/>
+          <w:noProof/>
         </w:rPr>
         <w:footnoteRef/>
       </w:r>
@@ -7035,6 +7566,7 @@
           <w:rFonts w:ascii="David" w:cs="David" w:eastAsia="David" w:hAnsi="David"/>
           <w:i w:val="false"/>
           <w:smallCaps w:val="false"/>
+          <w:noProof/>
           <w:sz w:val="20"/>
           <w:szCs w:val="20"/>
           <w:rtl/>
@@ -7048,6 +7580,7 @@
           <w:bCs/>
           <w:i w:val="false"/>
           <w:smallCaps w:val="false"/>
+          <w:noProof/>
           <w:sz w:val="20"/>
           <w:szCs w:val="20"/>
           <w:rtl/>
@@ -7059,6 +7592,7 @@
           <w:rFonts w:ascii="David" w:cs="David" w:eastAsia="David" w:hAnsi="David"/>
           <w:i w:val="false"/>
           <w:smallCaps w:val="false"/>
+          <w:noProof/>
           <w:sz w:val="20"/>
           <w:szCs w:val="20"/>
           <w:rtl/>
@@ -7077,6 +7611,7 @@
       <w:r>
         <w:rPr>
           <w:rStyle w:val="FootnoteReference"/>
+          <w:noProof/>
         </w:rPr>
         <w:footnoteRef/>
       </w:r>
@@ -7085,6 +7620,7 @@
           <w:rFonts w:ascii="David" w:cs="David" w:eastAsia="David" w:hAnsi="David"/>
           <w:i w:val="false"/>
           <w:smallCaps w:val="false"/>
+          <w:noProof/>
           <w:sz w:val="20"/>
           <w:szCs w:val="20"/>
           <w:rtl/>
@@ -7098,6 +7634,7 @@
           <w:bCs/>
           <w:i w:val="false"/>
           <w:smallCaps w:val="false"/>
+          <w:noProof/>
           <w:sz w:val="20"/>
           <w:szCs w:val="20"/>
           <w:rtl/>
@@ -7109,6 +7646,7 @@
           <w:rFonts w:ascii="David" w:cs="David" w:eastAsia="David" w:hAnsi="David"/>
           <w:i w:val="false"/>
           <w:smallCaps w:val="false"/>
+          <w:noProof/>
           <w:sz w:val="20"/>
           <w:szCs w:val="20"/>
           <w:rtl/>
@@ -7127,6 +7665,7 @@
       <w:r>
         <w:rPr>
           <w:rStyle w:val="FootnoteReference"/>
+          <w:noProof/>
         </w:rPr>
         <w:footnoteRef/>
       </w:r>
@@ -7135,6 +7674,7 @@
           <w:rFonts w:ascii="David" w:cs="David" w:eastAsia="David" w:hAnsi="David"/>
           <w:i w:val="false"/>
           <w:smallCaps w:val="false"/>
+          <w:noProof/>
           <w:sz w:val="20"/>
           <w:szCs w:val="20"/>
           <w:rtl/>
@@ -7148,6 +7688,7 @@
           <w:bCs/>
           <w:i w:val="false"/>
           <w:smallCaps w:val="false"/>
+          <w:noProof/>
           <w:sz w:val="20"/>
           <w:szCs w:val="20"/>
           <w:rtl/>
@@ -7159,6 +7700,7 @@
           <w:rFonts w:ascii="David" w:cs="David" w:eastAsia="David" w:hAnsi="David"/>
           <w:i w:val="false"/>
           <w:smallCaps w:val="false"/>
+          <w:noProof/>
           <w:sz w:val="20"/>
           <w:szCs w:val="20"/>
           <w:rtl/>
@@ -7177,6 +7719,7 @@
       <w:r>
         <w:rPr>
           <w:rStyle w:val="FootnoteReference"/>
+          <w:noProof/>
         </w:rPr>
         <w:footnoteRef/>
       </w:r>
@@ -7185,6 +7728,7 @@
           <w:rFonts w:ascii="David" w:cs="David" w:eastAsia="David" w:hAnsi="David"/>
           <w:i w:val="false"/>
           <w:smallCaps w:val="false"/>
+          <w:noProof/>
           <w:sz w:val="20"/>
           <w:szCs w:val="20"/>
           <w:rtl/>
@@ -7198,6 +7742,7 @@
           <w:bCs/>
           <w:i w:val="false"/>
           <w:smallCaps w:val="false"/>
+          <w:noProof/>
           <w:sz w:val="20"/>
           <w:szCs w:val="20"/>
           <w:rtl/>
@@ -7209,6 +7754,7 @@
           <w:rFonts w:ascii="David" w:cs="David" w:eastAsia="David" w:hAnsi="David"/>
           <w:i w:val="false"/>
           <w:smallCaps w:val="false"/>
+          <w:noProof/>
           <w:sz w:val="20"/>
           <w:szCs w:val="20"/>
           <w:rtl/>
@@ -7222,6 +7768,7 @@
           <w:bCs/>
           <w:i w:val="false"/>
           <w:smallCaps w:val="false"/>
+          <w:noProof/>
           <w:sz w:val="20"/>
           <w:szCs w:val="20"/>
           <w:rtl/>
@@ -7233,6 +7780,7 @@
           <w:rFonts w:ascii="David" w:cs="David" w:eastAsia="David" w:hAnsi="David"/>
           <w:i w:val="false"/>
           <w:smallCaps w:val="false"/>
+          <w:noProof/>
           <w:sz w:val="20"/>
           <w:szCs w:val="20"/>
           <w:rtl/>
@@ -7251,6 +7799,7 @@
       <w:r>
         <w:rPr>
           <w:rStyle w:val="FootnoteReference"/>
+          <w:noProof/>
         </w:rPr>
         <w:footnoteRef/>
       </w:r>
@@ -7259,6 +7808,7 @@
           <w:rFonts w:ascii="David" w:cs="David" w:eastAsia="David" w:hAnsi="David"/>
           <w:i w:val="false"/>
           <w:smallCaps w:val="false"/>
+          <w:noProof/>
           <w:sz w:val="20"/>
           <w:szCs w:val="20"/>
           <w:rtl/>
@@ -7277,6 +7827,7 @@
       <w:r>
         <w:rPr>
           <w:rStyle w:val="FootnoteReference"/>
+          <w:noProof/>
         </w:rPr>
         <w:footnoteRef/>
       </w:r>
@@ -7285,6 +7836,7 @@
           <w:rFonts w:ascii="David" w:cs="David" w:eastAsia="David" w:hAnsi="David"/>
           <w:i w:val="false"/>
           <w:smallCaps w:val="false"/>
+          <w:noProof/>
           <w:sz w:val="20"/>
           <w:szCs w:val="20"/>
           <w:rtl/>
@@ -7298,6 +7850,7 @@
           <w:bCs/>
           <w:i w:val="false"/>
           <w:smallCaps w:val="false"/>
+          <w:noProof/>
           <w:sz w:val="20"/>
           <w:szCs w:val="20"/>
           <w:rtl/>
@@ -7309,6 +7862,7 @@
           <w:rFonts w:ascii="David" w:cs="David" w:eastAsia="David" w:hAnsi="David"/>
           <w:i w:val="false"/>
           <w:smallCaps w:val="false"/>
+          <w:noProof/>
           <w:sz w:val="20"/>
           <w:szCs w:val="20"/>
           <w:rtl/>
@@ -7327,6 +7881,7 @@
       <w:r>
         <w:rPr>
           <w:rStyle w:val="FootnoteReference"/>
+          <w:noProof/>
         </w:rPr>
         <w:footnoteRef/>
       </w:r>
@@ -7335,6 +7890,7 @@
           <w:rFonts w:ascii="David" w:cs="David" w:eastAsia="David" w:hAnsi="David"/>
           <w:i w:val="false"/>
           <w:smallCaps w:val="false"/>
+          <w:noProof/>
           <w:sz w:val="20"/>
           <w:szCs w:val="20"/>
           <w:rtl/>
@@ -7348,6 +7904,7 @@
           <w:bCs/>
           <w:i w:val="false"/>
           <w:smallCaps w:val="false"/>
+          <w:noProof/>
           <w:sz w:val="20"/>
           <w:szCs w:val="20"/>
           <w:rtl/>
@@ -7359,6 +7916,7 @@
           <w:rFonts w:ascii="David" w:cs="David" w:eastAsia="David" w:hAnsi="David"/>
           <w:i w:val="false"/>
           <w:smallCaps w:val="false"/>
+          <w:noProof/>
           <w:sz w:val="20"/>
           <w:szCs w:val="20"/>
           <w:rtl/>
@@ -7377,6 +7935,7 @@
       <w:r>
         <w:rPr>
           <w:rStyle w:val="FootnoteReference"/>
+          <w:noProof/>
         </w:rPr>
         <w:footnoteRef/>
       </w:r>
@@ -7385,6 +7944,7 @@
           <w:rFonts w:ascii="David" w:cs="David" w:eastAsia="David" w:hAnsi="David"/>
           <w:i w:val="false"/>
           <w:smallCaps w:val="false"/>
+          <w:noProof/>
           <w:sz w:val="20"/>
           <w:szCs w:val="20"/>
           <w:rtl/>
@@ -7398,6 +7958,7 @@
           <w:bCs/>
           <w:i w:val="false"/>
           <w:smallCaps w:val="false"/>
+          <w:noProof/>
           <w:sz w:val="20"/>
           <w:szCs w:val="20"/>
           <w:rtl/>
@@ -7409,6 +7970,7 @@
           <w:rFonts w:ascii="David" w:cs="David" w:eastAsia="David" w:hAnsi="David"/>
           <w:i w:val="false"/>
           <w:smallCaps w:val="false"/>
+          <w:noProof/>
           <w:sz w:val="20"/>
           <w:szCs w:val="20"/>
           <w:rtl/>
@@ -7427,6 +7989,7 @@
       <w:r>
         <w:rPr>
           <w:rStyle w:val="FootnoteReference"/>
+          <w:noProof/>
         </w:rPr>
         <w:footnoteRef/>
       </w:r>
@@ -7435,6 +7998,7 @@
           <w:rFonts w:ascii="David" w:cs="David" w:eastAsia="David" w:hAnsi="David"/>
           <w:i w:val="false"/>
           <w:smallCaps w:val="false"/>
+          <w:noProof/>
           <w:sz w:val="20"/>
           <w:szCs w:val="20"/>
           <w:rtl/>
@@ -7448,6 +8012,7 @@
           <w:bCs/>
           <w:i w:val="false"/>
           <w:smallCaps w:val="false"/>
+          <w:noProof/>
           <w:sz w:val="20"/>
           <w:szCs w:val="20"/>
           <w:rtl/>
@@ -7459,6 +8024,7 @@
           <w:rFonts w:ascii="David" w:cs="David" w:eastAsia="David" w:hAnsi="David"/>
           <w:i w:val="false"/>
           <w:smallCaps w:val="false"/>
+          <w:noProof/>
           <w:sz w:val="20"/>
           <w:szCs w:val="20"/>
           <w:rtl/>
@@ -7477,6 +8043,7 @@
       <w:r>
         <w:rPr>
           <w:rStyle w:val="FootnoteReference"/>
+          <w:noProof/>
         </w:rPr>
         <w:footnoteRef/>
       </w:r>
@@ -7485,6 +8052,7 @@
           <w:rFonts w:ascii="David" w:cs="David" w:eastAsia="David" w:hAnsi="David"/>
           <w:i w:val="false"/>
           <w:smallCaps w:val="false"/>
+          <w:noProof/>
           <w:sz w:val="20"/>
           <w:szCs w:val="20"/>
           <w:rtl/>
@@ -7611,6 +8179,7 @@
     <w:next w:val="Normal"/>
     <w:qFormat/>
     <w:rPr>
+      <w:noProof/>
       <w:sz w:val="56"/>
       <w:szCs w:val="56"/>
     </w:rPr>
@@ -7621,6 +8190,7 @@
     <w:next w:val="Normal"/>
     <w:qFormat/>
     <w:rPr>
+      <w:noProof/>
       <w:color w:val="2E74B5"/>
       <w:sz w:val="32"/>
       <w:szCs w:val="32"/>
@@ -7632,6 +8202,7 @@
     <w:next w:val="Normal"/>
     <w:qFormat/>
     <w:rPr>
+      <w:noProof/>
       <w:color w:val="2E74B5"/>
       <w:sz w:val="26"/>
       <w:szCs w:val="26"/>
@@ -7643,6 +8214,7 @@
     <w:next w:val="Normal"/>
     <w:qFormat/>
     <w:rPr>
+      <w:noProof/>
       <w:color w:val="1F4D78"/>
       <w:sz w:val="24"/>
       <w:szCs w:val="24"/>
@@ -7656,6 +8228,7 @@
     <w:rPr>
       <w:i/>
       <w:iCs/>
+      <w:noProof/>
       <w:color w:val="2E74B5"/>
     </w:rPr>
   </w:style>
@@ -7665,6 +8238,7 @@
     <w:next w:val="Normal"/>
     <w:qFormat/>
     <w:rPr>
+      <w:noProof/>
       <w:color w:val="2E74B5"/>
     </w:rPr>
   </w:style>
@@ -7674,6 +8248,7 @@
     <w:next w:val="Normal"/>
     <w:qFormat/>
     <w:rPr>
+      <w:noProof/>
       <w:color w:val="1F4D78"/>
     </w:rPr>
   </w:style>
@@ -7685,6 +8260,7 @@
     <w:rPr>
       <w:b/>
       <w:bCs/>
+      <w:noProof/>
     </w:rPr>
   </w:style>
   <w:style w:type="paragraph" w:styleId="ListParagraph">
@@ -7698,6 +8274,7 @@
     <w:uiPriority w:val="99"/>
     <w:unhideWhenUsed/>
     <w:rPr>
+      <w:noProof/>
       <w:color w:val="0563C1"/>
       <w:u w:val="single"/>
     </w:rPr>
@@ -7709,6 +8286,7 @@
     <w:semiHidden/>
     <w:unhideWhenUsed/>
     <w:rPr>
+      <w:noProof/>
       <w:vertAlign w:val="superscript"/>
     </w:rPr>
   </w:style>
@@ -7723,6 +8301,7 @@
       <w:spacing w:after="0" w:line="240" w:lineRule="auto"/>
     </w:pPr>
     <w:rPr>
+      <w:noProof/>
       <w:sz w:val="20"/>
       <w:szCs w:val="20"/>
     </w:rPr>
@@ -7735,6 +8314,7 @@
     <w:semiHidden/>
     <w:unhideWhenUsed/>
     <w:rPr>
+      <w:noProof/>
       <w:sz w:val="20"/>
       <w:szCs w:val="20"/>
     </w:rPr>
@@ -7746,6 +8326,7 @@
     <w:semiHidden/>
     <w:unhideWhenUsed/>
     <w:rPr>
+      <w:noProof/>
       <w:vertAlign w:val="superscript"/>
     </w:rPr>
   </w:style>
@@ -7760,6 +8341,7 @@
       <w:spacing w:after="0" w:line="240" w:lineRule="auto"/>
     </w:pPr>
     <w:rPr>
+      <w:noProof/>
       <w:sz w:val="20"/>
       <w:szCs w:val="20"/>
     </w:rPr>
@@ -7772,6 +8354,7 @@
     <w:semiHidden/>
     <w:unhideWhenUsed/>
     <w:rPr>
+      <w:noProof/>
       <w:sz w:val="20"/>
       <w:szCs w:val="20"/>
     </w:rPr>
@@ -7789,6 +8372,7 @@
       <w:rFonts w:ascii="David" w:cs="David" w:eastAsia="David" w:hAnsi="David"/>
       <w:b/>
       <w:bCs/>
+      <w:noProof/>
       <w:color w:val="000000"/>
       <w:sz w:val="28"/>
       <w:szCs w:val="28"/>
@@ -7807,6 +8391,7 @@
       <w:rFonts w:ascii="David" w:cs="David" w:eastAsia="David" w:hAnsi="David"/>
       <w:b/>
       <w:bCs/>
+      <w:noProof/>
       <w:color w:val="000000"/>
       <w:sz w:val="24"/>
       <w:szCs w:val="24"/>

</xml_diff>

<commit_message>
Add college logo to seminar title page
Co-Authored-By: Claude Opus 5.5 <noreply@anthropic.com>
Claude-Session: https://claude.ai/code/session_01FmsKn8wvowcyLJgtaEyV4v
</commit_message>
<xml_diff>
--- a/seminar/עבירת-ההסתה-לגזענות-מיני-סמינר.docx
+++ b/seminar/עבירת-ההסתה-לגזענות-מיני-סמינר.docx
@@ -4,29 +4,54 @@
   <w:body>
     <w:p>
       <w:pPr>
-        <w:bidi/>
-        <w:spacing w:after="120" w:before="0" w:line="360"/>
+        <w:spacing w:after="120"/>
         <w:jc w:val="center"/>
       </w:pPr>
       <w:r>
-        <w:rPr>
-          <w:rFonts w:ascii="David" w:cs="David" w:eastAsia="David" w:hAnsi="David"/>
-          <w:b/>
-          <w:bCs/>
-          <w:i w:val="false"/>
-          <w:smallCaps w:val="false"/>
-          <w:noProof/>
-          <w:sz w:val="28"/>
-          <w:szCs w:val="28"/>
-          <w:rtl/>
-        </w:rPr>
-        <w:t xml:space="preserve">המכללה האקדמית נתניה</w:t>
-      </w:r>
-    </w:p>
-    <w:p>
-      <w:pPr>
-        <w:bidi/>
-        <w:spacing w:after="1200" w:before="0" w:line="360"/>
+        <w:drawing>
+          <wp:inline distT="0" distB="0" distL="0" distR="0">
+            <wp:extent cx="1619250" cy="1619250"/>
+            <wp:effectExtent t="0" r="0" b="0" l="0"/>
+            <wp:docPr id="1" name="logo" descr="המכללה האקדמית נתניה" title="לוגו"/>
+            <wp:cNvGraphicFramePr>
+              <a:graphicFrameLocks xmlns:a="http://schemas.openxmlformats.org/drawingml/2006/main" noChangeAspect="1"/>
+            </wp:cNvGraphicFramePr>
+            <a:graphic xmlns:a="http://schemas.openxmlformats.org/drawingml/2006/main">
+              <a:graphicData uri="http://schemas.openxmlformats.org/drawingml/2006/picture">
+                <pic:pic xmlns:pic="http://schemas.openxmlformats.org/drawingml/2006/picture">
+                  <pic:nvPicPr>
+                    <pic:cNvPr id="0" name="" descr=""/>
+                    <pic:cNvPicPr>
+                      <a:picLocks noChangeAspect="1" noChangeArrowheads="1"/>
+                    </pic:cNvPicPr>
+                  </pic:nvPicPr>
+                  <pic:blipFill>
+                    <a:blip r:embed="rId9" cstate="none"/>
+                    <a:srcRect/>
+                    <a:stretch>
+                      <a:fillRect/>
+                    </a:stretch>
+                  </pic:blipFill>
+                  <pic:spPr bwMode="auto">
+                    <a:xfrm>
+                      <a:off x="0" y="0"/>
+                      <a:ext cx="1619250" cy="1619250"/>
+                    </a:xfrm>
+                    <a:prstGeom prst="rect">
+                      <a:avLst/>
+                    </a:prstGeom>
+                  </pic:spPr>
+                </pic:pic>
+              </a:graphicData>
+            </a:graphic>
+          </wp:inline>
+        </w:drawing>
+      </w:r>
+    </w:p>
+    <w:p>
+      <w:pPr>
+        <w:bidi/>
+        <w:spacing w:after="900" w:before="0" w:line="360"/>
         <w:jc w:val="center"/>
       </w:pPr>
       <w:r>

</xml_diff>